<commit_message>
Audit clean numerical reproduction and revise journal manuscript with coauthors
</commit_message>
<xml_diff>
--- a/manuscript/Ibragimov_Aibar_Article_Revised.docx
+++ b/manuscript/Ibragimov_Aibar_Article_Revised.docx
@@ -5,7 +5,7 @@
     <w:p>
       <w:pPr>
         <w:pStyle w:val="Authors"/>
-        <w:jc w:val="both"/>
+        <w:jc w:val="left"/>
       </w:pPr>
       <w:r>
         <w:rPr>
@@ -16,7 +16,7 @@
     </w:p>
     <w:p>
       <w:pPr>
-        <w:jc w:val="both"/>
+        <w:jc w:val="left"/>
         <w:rPr>
           <w:lang w:val="en-US"/>
         </w:rPr>
@@ -31,7 +31,7 @@
     </w:p>
     <w:p>
       <w:pPr>
-        <w:jc w:val="both"/>
+        <w:jc w:val="left"/>
         <w:rPr>
           <w:lang w:val="en-US"/>
         </w:rPr>
@@ -41,7 +41,97 @@
           <w:rFonts w:eastAsia="Times New Roman"/>
           <w:lang w:val="en-US"/>
         </w:rPr>
-        <w:t>Research and Innovation Center “CyberTech”, Astana IT University, Astana, Kazakhstan. ORCID: 0009-0002-7454-2382</w:t>
+        <w:t xml:space="preserve">Master's student. Research and Innovation Center “CyberTech”, Astana IT University, Astana, Kazakhstan.</w:t>
+        <w:br/>
+        <w:t>ORCID: 0009-0002-7454-2382</w:t>
+      </w:r>
+    </w:p>
+    <w:p>
+      <w:pPr>
+        <w:pStyle w:val="Authors"/>
+        <w:jc w:val="left"/>
+      </w:pPr>
+      <w:r>
+        <w:rPr>
+          <w:b/>
+        </w:rPr>
+        <w:t xml:space="preserve">Leila Rzayeva</w:t>
+      </w:r>
+    </w:p>
+    <w:p>
+      <w:pPr>
+        <w:jc w:val="left"/>
+        <w:rPr>
+          <w:lang w:val="en-US"/>
+        </w:rPr>
+      </w:pPr>
+      <w:r>
+        <w:rPr>
+          <w:rFonts w:eastAsia="Times New Roman"/>
+          <w:lang w:val="en-US"/>
+        </w:rPr>
+        <w:t xml:space="preserve">l.rzayeva@astanait.edu.kz</w:t>
+      </w:r>
+    </w:p>
+    <w:p>
+      <w:pPr>
+        <w:jc w:val="left"/>
+        <w:rPr>
+          <w:lang w:val="en-US"/>
+        </w:rPr>
+      </w:pPr>
+      <w:r>
+        <w:rPr>
+          <w:rFonts w:eastAsia="Times New Roman"/>
+          <w:lang w:val="en-US"/>
+        </w:rPr>
+        <w:t xml:space="preserve">Research and Innovation Center “CyberTech”, Astana IT University, Astana, Kazakhstan.</w:t>
+        <w:br/>
+        <w:t>ORCID: 0000-0002-3382-4685</w:t>
+      </w:r>
+    </w:p>
+    <w:p>
+      <w:pPr>
+        <w:pStyle w:val="Authors"/>
+        <w:jc w:val="left"/>
+      </w:pPr>
+      <w:r>
+        <w:rPr>
+          <w:b/>
+        </w:rPr>
+        <w:t xml:space="preserve">Laura Aldasheva</w:t>
+      </w:r>
+    </w:p>
+    <w:p>
+      <w:pPr>
+        <w:jc w:val="left"/>
+        <w:rPr>
+          <w:lang w:val="en-US"/>
+        </w:rPr>
+      </w:pPr>
+      <w:r>
+        <w:rPr>
+          <w:rFonts w:eastAsia="Times New Roman"/>
+          <w:lang w:val="en-US"/>
+        </w:rPr>
+        <w:t xml:space="preserve">laura.aldasheva@astanait.edu.kz</w:t>
+      </w:r>
+    </w:p>
+    <w:p>
+      <w:pPr>
+        <w:jc w:val="left"/>
+        <w:rPr>
+          <w:lang w:val="en-US"/>
+        </w:rPr>
+      </w:pPr>
+      <w:r>
+        <w:rPr>
+          <w:rFonts w:eastAsia="Times New Roman"/>
+          <w:lang w:val="en-US"/>
+        </w:rPr>
+        <w:t xml:space="preserve">School of Intelligent Systems, Astana IT University, Astana, Kazakhstan.</w:t>
+        <w:br/>
+        <w:t>ORCID: 0000-0001-6815-1989</w:t>
       </w:r>
     </w:p>
     <w:p>
@@ -87,7 +177,7 @@
           <w:color w:val="000000"/>
           <w:sz w:val="24"/>
         </w:rPr>
-        <w:t>Abstract: A complete telemetry vector may combine fields from different source captures, and repeated values can conceal this mixture. This paper develops a provenance-based verification contract for a receiver with partial information. Its contribution is an explicit separation between atomic access and evidence of common capture, with compatible-explanation verdicts and quantitative limits on detection from values. Exact enumeration and a synthetic discrete-event study compare separate-field and whole-object publication across 12 conditions, 960 mode runs and 3.84 million scheduled reads. Under 5% independent message loss without restart, separate-field publication mixes generations in 62.14% of reads despite complete field availability. Whole-object publication preserves coherence under the stated capture and access contract, while loss and restart can still reduce freshness and availability. Source repetition substantially changes the detectable fraction of mixing. Code, synthetic data and independent validators accompany the study. The findings support evaluating provenance evidence alongside fresh coherent availability; physical-device performance remains unmeasured.</w:t>
+        <w:t xml:space="preserve">Abstract: Industrial applications often combine received sensor fields when deciding whether a process is healthy. A complete vector can nevertheless contain values from different source captures, and repeated values can hide this mixture. This study asks what a receiver on a one-way link can establish about common capture when only values, origin identifiers or grouping evidence are available. The contribution is a provenance contract with an explicit rule for conclusive and ambiguous verdicts, and a quantitative assessment of the mixing that values alone cannot reveal. The method uses compatible explanations, exact finite-state checks and a discrete-event experiment comparing separate-field and whole-object publication. Twelve synthetic conditions vary source correlation, message loss and receiver restart. Forty replicate indices per condition produce 960 mode runs and 3.84 million scheduled reads. Under independent message loss of 5% without restart, separate-field publication mixes generations in 62.14% of reads despite complete field availability. Whole-object publication has no mixed reads under the stated capture, binding and access assumptions. With identical delivery schedules and no loss, values reveal 5.88%, 49.84% and 79.13% of mixed reads as source flip probability rises from 0.05 to 0.50 and 0.95. Bursts and restart still limit the availability of a fresh coherent state. Independent event reconstruction checks the saved logs, while a clean rerun regenerates the numerical results from the supplied code. The findings show why provenance evidence and fresh coherent availability should accompany completeness and error rates. All data and timings are synthetic; physical-device performance is not measured and requires separate field validation.</w:t>
       </w:r>
     </w:p>
     <w:p>
@@ -111,7 +201,7 @@
           <w:color w:val="000000"/>
           <w:sz w:val="24"/>
         </w:rPr>
-        <w:t>Keywords: unidirectional telemetry, snapshot coherence, provenance, partial observation, runtime verification, discrete-event simulation.</w:t>
+        <w:t xml:space="preserve">Keywords: unidirectional telemetry, snapshot coherence, provenance, partial observation, runtime verification, simulation.</w:t>
       </w:r>
     </w:p>
     <w:p>
@@ -142,8 +232,8 @@
         <w:keepLines w:val="0"/>
         <w:pageBreakBefore w:val="0"/>
         <w:widowControl/>
-        <w:spacing w:line="240" w:lineRule="auto" w:after="100" w:before="0"/>
-        <w:ind w:firstLine="425"/>
+        <w:spacing w:line="240" w:lineRule="auto" w:after="0" w:before="0"/>
+        <w:ind w:firstLine="709"/>
         <w:jc w:val="both"/>
         <w:rPr>
           <w:lang w:val="en-US"/>
@@ -166,8 +256,8 @@
         <w:keepLines w:val="0"/>
         <w:pageBreakBefore w:val="0"/>
         <w:widowControl/>
-        <w:spacing w:line="240" w:lineRule="auto" w:after="100" w:before="0"/>
-        <w:ind w:firstLine="425"/>
+        <w:spacing w:line="240" w:lineRule="auto" w:after="0" w:before="0"/>
+        <w:ind w:firstLine="709"/>
         <w:jc w:val="both"/>
         <w:rPr>
           <w:lang w:val="en-US"/>
@@ -190,8 +280,8 @@
         <w:keepLines w:val="0"/>
         <w:pageBreakBefore w:val="0"/>
         <w:widowControl/>
-        <w:spacing w:line="240" w:lineRule="auto" w:after="100" w:before="0"/>
-        <w:ind w:firstLine="425"/>
+        <w:spacing w:line="240" w:lineRule="auto" w:after="0" w:before="0"/>
+        <w:ind w:firstLine="709"/>
         <w:jc w:val="both"/>
         <w:rPr>
           <w:lang w:val="en-US"/>
@@ -239,8 +329,8 @@
         <w:keepLines w:val="0"/>
         <w:pageBreakBefore w:val="0"/>
         <w:widowControl/>
-        <w:spacing w:line="240" w:lineRule="auto" w:after="100" w:before="0"/>
-        <w:ind w:firstLine="425"/>
+        <w:spacing w:line="240" w:lineRule="auto" w:after="0" w:before="0"/>
+        <w:ind w:firstLine="709"/>
         <w:jc w:val="both"/>
         <w:rPr>
           <w:lang w:val="en-US"/>
@@ -254,7 +344,7 @@
           <w:color w:val="000000"/>
           <w:sz w:val="24"/>
         </w:rPr>
-        <w:t>The proposed method makes common source capture an explicit property of the receiving vector. It distinguishes the actual origins, known to the reference, from the evidence available to a deployed monitor. This exposes cases in which an atomic receiver read returns a vector that cannot be certified as one source generation.</w:t>
+        <w:t xml:space="preserve">The added contribution is a criterion for deciding what common source capture can be established at the receiving interface. For complete observations, it distinguishes proved coherence, proved mixing, insufficient evidence and contradiction, using only the values and provenance evidence exposed to the monitor.</w:t>
       </w:r>
     </w:p>
     <w:p>
@@ -263,8 +353,8 @@
         <w:keepLines w:val="0"/>
         <w:pageBreakBefore w:val="0"/>
         <w:widowControl/>
-        <w:spacing w:line="240" w:lineRule="auto" w:after="100" w:before="0"/>
-        <w:ind w:firstLine="425"/>
+        <w:spacing w:line="240" w:lineRule="auto" w:after="0" w:before="0"/>
+        <w:ind w:firstLine="709"/>
         <w:jc w:val="both"/>
         <w:rPr>
           <w:lang w:val="en-US"/>
@@ -278,7 +368,7 @@
           <w:color w:val="000000"/>
           <w:sz w:val="24"/>
         </w:rPr>
-        <w:t>The compatible-explanation rule specializes partial-observation monitoring to this property. It establishes conditional soundness and identifies when origin or grouping evidence resolves repeated-value ambiguity. For the repeated diagonal family, it gives an equality-graph certificate; collision and Markov-lag formulas quantify the fraction of mixing visible from values.</w:t>
+        <w:t xml:space="preserve">For the declared repeated diagonal family, the paper derives an equality-evidence certificate and quantifies the fraction of mixing visible from values through collision and Markov-lag formulas. These results identify when repeated values prevent a conclusive decision, even if the receiver reads all fields atomically.</w:t>
       </w:r>
     </w:p>
     <w:p>
@@ -287,8 +377,8 @@
         <w:keepLines w:val="0"/>
         <w:pageBreakBefore w:val="0"/>
         <w:widowControl/>
-        <w:spacing w:line="240" w:lineRule="auto" w:after="100" w:before="0"/>
-        <w:ind w:firstLine="425"/>
+        <w:spacing w:line="240" w:lineRule="auto" w:after="0" w:before="0"/>
+        <w:ind w:firstLine="709"/>
         <w:jc w:val="both"/>
         <w:rPr>
           <w:lang w:val="en-US"/>
@@ -302,7 +392,7 @@
           <w:color w:val="000000"/>
           <w:sz w:val="24"/>
         </w:rPr>
-        <w:t>The computational study connects these observation limits to publication, loss and restart through paired measurements of mixing, coverage and fresh coherent availability. Atomic snapshots, linearizability and inconclusive monitoring are established foundations; the claimed addition is this provenance-specific contract, evidence criterion and quantitative evaluation.</w:t>
+        <w:t xml:space="preserve">A paired computational study then measures hidden mixing, evidential coverage and fresh coherent availability under publication, loss and restart. Atomic snapshots, linearizability and inconclusive monitoring remain the established foundations; the contribution is the explicit provenance contract, its evidence conditions and their quantitative evaluation for one-way telemetry.</w:t>
       </w:r>
     </w:p>
     <w:p>
@@ -333,8 +423,8 @@
         <w:keepLines w:val="0"/>
         <w:pageBreakBefore w:val="0"/>
         <w:widowControl/>
-        <w:spacing w:line="240" w:lineRule="auto" w:after="100" w:before="0"/>
-        <w:ind w:firstLine="425"/>
+        <w:spacing w:line="240" w:lineRule="auto" w:after="0" w:before="0"/>
+        <w:ind w:firstLine="709"/>
         <w:jc w:val="both"/>
         <w:rPr>
           <w:lang w:val="en-US"/>
@@ -348,7 +438,7 @@
           <w:color w:val="000000"/>
           <w:sz w:val="24"/>
         </w:rPr>
-        <w:t>Atomic snapshots provide an indivisible view of concurrent registers [3], and linearizability relates operations to a sequential object specification [4]. Whether such a view represents one application capture depends on that specification and the update protocol. Chandy and Lamport instead reconstruct distributed global state, including channels [5]. Here the property is common capture provenance of fields exposed at one receiving interface. Logical origin identity is distinct from physical time [6].</w:t>
+        <w:t xml:space="preserve">Atomic snapshots and linearizability define indivisible access to concurrent objects [3]. Whether a returned vector represents one application capture depends on the object specification and update protocol. Distributed snapshots instead account for process and channel state, while logical clocks describe event order [4]. Here the property is common capture provenance at one receiving interface.</w:t>
       </w:r>
     </w:p>
     <w:p>
@@ -357,8 +447,8 @@
         <w:keepLines w:val="0"/>
         <w:pageBreakBefore w:val="0"/>
         <w:widowControl/>
-        <w:spacing w:line="240" w:lineRule="auto" w:after="100" w:before="0"/>
-        <w:ind w:firstLine="425"/>
+        <w:spacing w:line="240" w:lineRule="auto" w:after="0" w:before="0"/>
+        <w:ind w:firstLine="709"/>
         <w:jc w:val="both"/>
         <w:rPr>
           <w:lang w:val="en-US"/>
@@ -372,7 +462,7 @@
           <w:color w:val="000000"/>
           <w:sz w:val="24"/>
         </w:rPr>
-        <w:t>Inconclusive verdicts and reasoning over compatible observations are established runtime-verification techniques [7, 8]. This work specializes them to field origins: different captures may produce identical values, so the monitor must preserve both explanations when the interface cannot distinguish them. OPC UA object serialization and publication mechanisms provide relevant implementation facilities [9, 10]; their guarantees depend on the declared capture and access boundaries.</w:t>
+        <w:t xml:space="preserve">Monitoring over unreliable, out-of-order streams and inconclusive verdicts are established runtime-verification topics [5,6]. Assumption-based approaches retain executions compatible with incomplete observations [7,8]. We specialize these ideas to field origins, without claiming a new general temporal logic. Repeated values can make coherent and mixed provenance indistinguishable. OPC UA serialization and PubSub provide grouping mechanisms [9,10]; access attributes and Read semantics define further server-side boundaries [11,12]. An adapter must still establish its own capture and access contract.</w:t>
       </w:r>
     </w:p>
     <w:p>
@@ -381,8 +471,8 @@
         <w:keepLines w:val="0"/>
         <w:pageBreakBefore w:val="0"/>
         <w:widowControl/>
-        <w:spacing w:line="240" w:lineRule="auto" w:after="100" w:before="0"/>
-        <w:ind w:firstLine="425"/>
+        <w:spacing w:line="240" w:lineRule="auto" w:after="0" w:before="0"/>
+        <w:ind w:firstLine="709"/>
         <w:jc w:val="both"/>
         <w:rPr>
           <w:lang w:val="en-US"/>
@@ -396,7 +486,7 @@
           <w:color w:val="000000"/>
           <w:sz w:val="24"/>
         </w:rPr>
-        <w:t>Status age motivates measuring temporal usefulness separately from provenance [11]. The burst model, random-stream organization and bootstrap analysis use established methods [12–14]. Following simulation-verification practice [15], proofs, enumeration and independent reconstruction check the declared synthetic model; they do not validate physical-channel parameters.</w:t>
+        <w:t xml:space="preserve">Age-of-information research separates data freshness from delivery [13], including industrial scheduling studies [14]. We measure fresh coherent availability rather than optimize a scheduler. Our burst process is a declared two-state Markov model, not a fitted device channel. Separate random streams and documented generator behavior support controlled comparisons [15,16]. Bootstrap design and simulation-reporting guidance motivate whole-run intervals and explicit model disclosure [17,18]. Repeating computations is distinct from validating a physical installation [19].</w:t>
       </w:r>
     </w:p>
     <w:p>
@@ -452,8 +542,8 @@
         <w:keepLines w:val="0"/>
         <w:pageBreakBefore w:val="0"/>
         <w:widowControl/>
-        <w:spacing w:line="240" w:lineRule="auto" w:after="100" w:before="0"/>
-        <w:ind w:firstLine="425"/>
+        <w:spacing w:line="240" w:lineRule="auto" w:after="0" w:before="0"/>
+        <w:ind w:firstLine="709"/>
         <w:jc w:val="both"/>
         <w:rPr>
           <w:lang w:val="en-US"/>
@@ -693,8 +783,8 @@
         <w:keepLines w:val="0"/>
         <w:pageBreakBefore w:val="0"/>
         <w:widowControl/>
-        <w:spacing w:line="240" w:lineRule="auto" w:after="100" w:before="0"/>
-        <w:ind w:firstLine="425"/>
+        <w:spacing w:line="240" w:lineRule="auto" w:after="0" w:before="0"/>
+        <w:ind w:firstLine="709"/>
         <w:jc w:val="both"/>
         <w:rPr>
           <w:lang w:val="en-US"/>
@@ -717,8 +807,8 @@
         <w:keepLines w:val="0"/>
         <w:pageBreakBefore w:val="0"/>
         <w:widowControl/>
-        <w:spacing w:line="240" w:lineRule="auto" w:after="100" w:before="0"/>
-        <w:ind w:firstLine="425"/>
+        <w:spacing w:line="240" w:lineRule="auto" w:after="0" w:before="0"/>
+        <w:ind w:firstLine="709"/>
         <w:jc w:val="both"/>
         <w:rPr>
           <w:lang w:val="en-US"/>
@@ -884,8 +974,8 @@
         <w:keepLines w:val="0"/>
         <w:pageBreakBefore w:val="0"/>
         <w:widowControl/>
-        <w:spacing w:line="240" w:lineRule="auto" w:after="100" w:before="0"/>
-        <w:ind w:firstLine="425"/>
+        <w:spacing w:line="240" w:lineRule="auto" w:after="0" w:before="0"/>
+        <w:ind w:firstLine="709"/>
         <w:jc w:val="both"/>
         <w:rPr>
           <w:lang w:val="en-US"/>
@@ -977,8 +1067,8 @@
         <w:keepLines w:val="0"/>
         <w:pageBreakBefore w:val="0"/>
         <w:widowControl/>
-        <w:spacing w:line="240" w:lineRule="auto" w:after="100" w:before="0"/>
-        <w:ind w:firstLine="425"/>
+        <w:spacing w:line="240" w:lineRule="auto" w:after="0" w:before="0"/>
+        <w:ind w:firstLine="709"/>
         <w:jc w:val="both"/>
         <w:rPr>
           <w:lang w:val="en-US"/>
@@ -1026,8 +1116,8 @@
         <w:keepLines w:val="0"/>
         <w:pageBreakBefore w:val="0"/>
         <w:widowControl/>
-        <w:spacing w:line="240" w:lineRule="auto" w:after="100" w:before="0"/>
-        <w:ind w:firstLine="425"/>
+        <w:spacing w:line="240" w:lineRule="auto" w:after="0" w:before="0"/>
+        <w:ind w:firstLine="709"/>
         <w:jc w:val="both"/>
         <w:rPr>
           <w:lang w:val="en-US"/>
@@ -1050,8 +1140,8 @@
         <w:keepLines w:val="0"/>
         <w:pageBreakBefore w:val="0"/>
         <w:widowControl/>
-        <w:spacing w:line="240" w:lineRule="auto" w:after="100" w:before="0"/>
-        <w:ind w:firstLine="425"/>
+        <w:spacing w:line="240" w:lineRule="auto" w:after="0" w:before="0"/>
+        <w:ind w:firstLine="709"/>
         <w:jc w:val="both"/>
         <w:rPr>
           <w:lang w:val="en-US"/>
@@ -1074,8 +1164,8 @@
         <w:keepLines w:val="0"/>
         <w:pageBreakBefore w:val="0"/>
         <w:widowControl/>
-        <w:spacing w:line="240" w:lineRule="auto" w:after="100" w:before="0"/>
-        <w:ind w:firstLine="425"/>
+        <w:spacing w:line="240" w:lineRule="auto" w:after="0" w:before="0"/>
+        <w:ind w:firstLine="709"/>
         <w:jc w:val="both"/>
         <w:rPr>
           <w:lang w:val="en-US"/>
@@ -1089,7 +1179,7 @@
           <w:color w:val="000000"/>
           <w:sz w:val="24"/>
         </w:rPr>
-        <w:t>Profile I detects unequal origins in these pairs; values alone cannot prove mixing under a catalogue that admits stopped, healthy and faulty operation. R1 installs each captured object as a unit, avoiding this cross-generation decision error while still requiring freshness checks. Adding one identifier after separate source reads would not satisfy the capture contract. This scenario explains the application consequence; the following binary study tests the verification mechanism rather than the pump’s physical dynamics.</w:t>
+        <w:t xml:space="preserve">Profile I detects unequal origins in these pairs; values alone cannot prove mixing under a catalogue that admits stopped, healthy and faulty operation. R1 installs each captured object as a unit, avoiding this cross-generation decision error while still requiring freshness checks. It cannot guarantee immediate fault detection when a new capture is delayed or lost. Adding one identifier after separate source reads would not satisfy the capture contract. This scenario explains the application consequence; the following binary study tests the verification mechanism rather than the pump’s physical dynamics.</w:t>
       </w:r>
     </w:p>
     <w:p>
@@ -1123,8 +1213,8 @@
         <w:keepLines w:val="0"/>
         <w:pageBreakBefore w:val="0"/>
         <w:widowControl/>
-        <w:spacing w:line="240" w:lineRule="auto" w:after="100" w:before="0"/>
-        <w:ind w:firstLine="425"/>
+        <w:spacing w:line="240" w:lineRule="auto" w:after="0" w:before="0"/>
+        <w:ind w:firstLine="709"/>
         <w:jc w:val="both"/>
         <w:rPr>
           <w:lang w:val="en-US"/>
@@ -1209,8 +1299,8 @@
         <w:keepLines w:val="0"/>
         <w:pageBreakBefore w:val="0"/>
         <w:widowControl/>
-        <w:spacing w:line="240" w:lineRule="auto" w:after="100" w:before="0"/>
-        <w:ind w:firstLine="425"/>
+        <w:spacing w:line="240" w:lineRule="auto" w:after="0" w:before="0"/>
+        <w:ind w:firstLine="709"/>
         <w:jc w:val="both"/>
         <w:rPr>
           <w:lang w:val="en-US"/>
@@ -1233,8 +1323,8 @@
         <w:keepLines w:val="0"/>
         <w:pageBreakBefore w:val="0"/>
         <w:widowControl/>
-        <w:spacing w:line="240" w:lineRule="auto" w:after="100" w:before="0"/>
-        <w:ind w:firstLine="425"/>
+        <w:spacing w:line="240" w:lineRule="auto" w:after="0" w:before="0"/>
+        <w:ind w:firstLine="709"/>
         <w:jc w:val="both"/>
         <w:rPr>
           <w:lang w:val="en-US"/>
@@ -1975,8 +2065,8 @@
         <w:keepLines w:val="0"/>
         <w:pageBreakBefore w:val="0"/>
         <w:widowControl/>
-        <w:spacing w:line="240" w:lineRule="auto" w:after="100" w:before="0"/>
-        <w:ind w:firstLine="425"/>
+        <w:spacing w:line="240" w:lineRule="auto" w:after="0" w:before="0"/>
+        <w:ind w:firstLine="709"/>
         <w:jc w:val="both"/>
         <w:rPr>
           <w:lang w:val="en-US"/>
@@ -2024,8 +2114,8 @@
         <w:keepLines w:val="0"/>
         <w:pageBreakBefore w:val="0"/>
         <w:widowControl/>
-        <w:spacing w:line="240" w:lineRule="auto" w:after="100" w:before="0"/>
-        <w:ind w:firstLine="425"/>
+        <w:spacing w:line="240" w:lineRule="auto" w:after="0" w:before="0"/>
+        <w:ind w:firstLine="709"/>
         <w:jc w:val="both"/>
         <w:rPr>
           <w:lang w:val="en-US"/>
@@ -2048,8 +2138,8 @@
         <w:keepLines w:val="0"/>
         <w:pageBreakBefore w:val="0"/>
         <w:widowControl/>
-        <w:spacing w:line="240" w:lineRule="auto" w:after="100" w:before="0"/>
-        <w:ind w:firstLine="425"/>
+        <w:spacing w:line="240" w:lineRule="auto" w:after="0" w:before="0"/>
+        <w:ind w:firstLine="709"/>
         <w:jc w:val="both"/>
         <w:rPr>
           <w:lang w:val="en-US"/>
@@ -2072,8 +2162,8 @@
         <w:keepLines w:val="0"/>
         <w:pageBreakBefore w:val="0"/>
         <w:widowControl/>
-        <w:spacing w:line="240" w:lineRule="auto" w:after="100" w:before="0"/>
-        <w:ind w:firstLine="425"/>
+        <w:spacing w:line="240" w:lineRule="auto" w:after="0" w:before="0"/>
+        <w:ind w:firstLine="709"/>
         <w:jc w:val="both"/>
         <w:rPr>
           <w:lang w:val="en-US"/>
@@ -2096,8 +2186,8 @@
         <w:keepLines w:val="0"/>
         <w:pageBreakBefore w:val="0"/>
         <w:widowControl/>
-        <w:spacing w:line="240" w:lineRule="auto" w:after="100" w:before="0"/>
-        <w:ind w:firstLine="425"/>
+        <w:spacing w:line="240" w:lineRule="auto" w:after="0" w:before="0"/>
+        <w:ind w:firstLine="709"/>
         <w:jc w:val="both"/>
         <w:rPr>
           <w:lang w:val="en-US"/>
@@ -3005,8 +3095,8 @@
         <w:keepLines w:val="0"/>
         <w:pageBreakBefore w:val="0"/>
         <w:widowControl/>
-        <w:spacing w:line="240" w:lineRule="auto" w:after="100" w:before="0"/>
-        <w:ind w:firstLine="425"/>
+        <w:spacing w:line="240" w:lineRule="auto" w:after="0" w:before="0"/>
+        <w:ind w:firstLine="709"/>
         <w:jc w:val="both"/>
         <w:rPr>
           <w:lang w:val="en-US"/>
@@ -3146,8 +3236,8 @@
         <w:keepLines w:val="0"/>
         <w:pageBreakBefore w:val="0"/>
         <w:widowControl/>
-        <w:spacing w:line="240" w:lineRule="auto" w:after="100" w:before="0"/>
-        <w:ind w:firstLine="425"/>
+        <w:spacing w:line="240" w:lineRule="auto" w:after="0" w:before="0"/>
+        <w:ind w:firstLine="709"/>
         <w:jc w:val="both"/>
         <w:rPr>
           <w:lang w:val="en-US"/>
@@ -3239,8 +3329,8 @@
         <w:keepLines w:val="0"/>
         <w:pageBreakBefore w:val="0"/>
         <w:widowControl/>
-        <w:spacing w:line="240" w:lineRule="auto" w:after="100" w:before="0"/>
-        <w:ind w:firstLine="425"/>
+        <w:spacing w:line="240" w:lineRule="auto" w:after="0" w:before="0"/>
+        <w:ind w:firstLine="709"/>
         <w:jc w:val="both"/>
         <w:rPr>
           <w:lang w:val="en-US"/>
@@ -3406,8 +3496,8 @@
         <w:keepLines w:val="0"/>
         <w:pageBreakBefore w:val="0"/>
         <w:widowControl/>
-        <w:spacing w:line="240" w:lineRule="auto" w:after="100" w:before="0"/>
-        <w:ind w:firstLine="425"/>
+        <w:spacing w:line="240" w:lineRule="auto" w:after="0" w:before="0"/>
+        <w:ind w:firstLine="709"/>
         <w:jc w:val="both"/>
         <w:rPr>
           <w:lang w:val="en-US"/>
@@ -3635,8 +3725,8 @@
         <w:keepLines w:val="0"/>
         <w:pageBreakBefore w:val="0"/>
         <w:widowControl/>
-        <w:spacing w:line="240" w:lineRule="auto" w:after="100" w:before="0"/>
-        <w:ind w:firstLine="425"/>
+        <w:spacing w:line="240" w:lineRule="auto" w:after="0" w:before="0"/>
+        <w:ind w:firstLine="709"/>
         <w:jc w:val="both"/>
         <w:rPr>
           <w:lang w:val="en-US"/>
@@ -3681,8 +3771,8 @@
         <w:keepLines w:val="0"/>
         <w:pageBreakBefore w:val="0"/>
         <w:widowControl/>
-        <w:spacing w:line="240" w:lineRule="auto" w:after="100" w:before="0"/>
-        <w:ind w:firstLine="425"/>
+        <w:spacing w:line="240" w:lineRule="auto" w:after="0" w:before="0"/>
+        <w:ind w:firstLine="709"/>
         <w:jc w:val="both"/>
         <w:rPr>
           <w:lang w:val="en-US"/>
@@ -3696,7 +3786,7 @@
           <w:color w:val="000000"/>
           <w:sz w:val="24"/>
         </w:rPr>
-        <w:t>The experiment crosses α=0.05, 0.50 and 0.95 with three channels: no loss, independent loss and shared burst loss. Three additional conditions test receiver restart at α=0.50 (Table 3). Forty independent replicate indices per condition yield 480 condition-specific pairs and 960 mode runs. Common random inputs couple conditions, so the 480 pairs are not mutually independent. Factors and analysis settings were fixed before execution.</w:t>
+        <w:t xml:space="preserve">The experiment crosses α=0.05, 0.50 and 0.95 with three channels: no loss, independent loss and shared burst loss. Three additional conditions test receiver restart at α=0.50 (Table 3). Forty independent replicate indices per condition yield 480 condition-specific pairs and 960 mode runs. Common random inputs couple conditions, so the 480 pairs are not mutually independent. Table 3 and the artifact configuration record the declared factors and analysis settings.</w:t>
       </w:r>
     </w:p>
     <w:p>
@@ -5508,8 +5598,8 @@
         <w:keepLines w:val="0"/>
         <w:pageBreakBefore w:val="0"/>
         <w:widowControl/>
-        <w:spacing w:line="240" w:lineRule="auto" w:after="100" w:before="0"/>
-        <w:ind w:firstLine="425"/>
+        <w:spacing w:line="240" w:lineRule="auto" w:after="0" w:before="0"/>
+        <w:ind w:firstLine="709"/>
         <w:jc w:val="both"/>
         <w:rPr>
           <w:lang w:val="en-US"/>
@@ -5532,8 +5622,8 @@
         <w:keepLines w:val="0"/>
         <w:pageBreakBefore w:val="0"/>
         <w:widowControl/>
-        <w:spacing w:line="240" w:lineRule="auto" w:after="100" w:before="0"/>
-        <w:ind w:firstLine="425"/>
+        <w:spacing w:line="240" w:lineRule="auto" w:after="0" w:before="0"/>
+        <w:ind w:firstLine="709"/>
         <w:jc w:val="both"/>
         <w:rPr>
           <w:lang w:val="en-US"/>
@@ -5556,8 +5646,8 @@
         <w:keepLines w:val="0"/>
         <w:pageBreakBefore w:val="0"/>
         <w:widowControl/>
-        <w:spacing w:line="240" w:lineRule="auto" w:after="100" w:before="0"/>
-        <w:ind w:firstLine="425"/>
+        <w:spacing w:line="240" w:lineRule="auto" w:after="0" w:before="0"/>
+        <w:ind w:firstLine="709"/>
         <w:jc w:val="both"/>
         <w:rPr>
           <w:lang w:val="en-US"/>
@@ -5580,8 +5670,8 @@
         <w:keepLines w:val="0"/>
         <w:pageBreakBefore w:val="0"/>
         <w:widowControl/>
-        <w:spacing w:line="240" w:lineRule="auto" w:after="100" w:before="0"/>
-        <w:ind w:firstLine="425"/>
+        <w:spacing w:line="240" w:lineRule="auto" w:after="0" w:before="0"/>
+        <w:ind w:firstLine="709"/>
         <w:jc w:val="both"/>
         <w:rPr>
           <w:lang w:val="en-US"/>
@@ -5604,8 +5694,8 @@
         <w:keepLines w:val="0"/>
         <w:pageBreakBefore w:val="0"/>
         <w:widowControl/>
-        <w:spacing w:line="240" w:lineRule="auto" w:after="100" w:before="0"/>
-        <w:ind w:firstLine="425"/>
+        <w:spacing w:line="240" w:lineRule="auto" w:after="0" w:before="0"/>
+        <w:ind w:firstLine="709"/>
         <w:jc w:val="both"/>
         <w:rPr>
           <w:lang w:val="en-US"/>
@@ -5628,8 +5718,8 @@
         <w:keepLines w:val="0"/>
         <w:pageBreakBefore w:val="0"/>
         <w:widowControl/>
-        <w:spacing w:line="240" w:lineRule="auto" w:after="100" w:before="0"/>
-        <w:ind w:firstLine="425"/>
+        <w:spacing w:line="240" w:lineRule="auto" w:after="0" w:before="0"/>
+        <w:ind w:firstLine="709"/>
         <w:jc w:val="both"/>
         <w:rPr>
           <w:lang w:val="en-US"/>
@@ -5652,8 +5742,8 @@
         <w:keepLines w:val="0"/>
         <w:pageBreakBefore w:val="0"/>
         <w:widowControl/>
-        <w:spacing w:line="240" w:lineRule="auto" w:after="100" w:before="0"/>
-        <w:ind w:firstLine="425"/>
+        <w:spacing w:line="240" w:lineRule="auto" w:after="0" w:before="0"/>
+        <w:ind w:firstLine="709"/>
         <w:jc w:val="both"/>
         <w:rPr>
           <w:lang w:val="en-US"/>
@@ -5667,7 +5757,7 @@
           <w:color w:val="000000"/>
           <w:sz w:val="24"/>
         </w:rPr>
-        <w:t>Message-loss ratios use emissions over 24 s; state shares use the 20 s analysis window. Pointwise 95% intervals use 2,000 whole-run or paired-difference percentile-bootstrap resamples [14]. Age p95 is calculated per run over coherent reads, then averaged over 40 runs. Lag ratios are recomputed by resampling complete runs. Displayed percentages use decimal rounding from exact counts or run-level ratios. Intervals are descriptive, without multiplicity correction; temporally dependent reads are not independent replications.</w:t>
+        <w:t xml:space="preserve">Message-loss ratios use emissions over 24 s; state shares use the 20 s analysis window. Pointwise 95% intervals use 2,000 whole-run or paired-difference percentile-bootstrap resamples [17]. We use percentile intervals, not bias-corrected and accelerated intervals. Age p95 is calculated per run over coherent reads, then averaged over 40 runs. Lag ratios are recomputed by resampling complete runs. Displayed percentages use decimal rounding from exact counts or run-level ratios. Intervals are descriptive, without multiplicity correction; temporally dependent reads are not independent replications.</w:t>
       </w:r>
     </w:p>
     <w:p>
@@ -5723,8 +5813,8 @@
         <w:keepLines w:val="0"/>
         <w:pageBreakBefore w:val="0"/>
         <w:widowControl/>
-        <w:spacing w:line="240" w:lineRule="auto" w:after="100" w:before="0"/>
-        <w:ind w:firstLine="425"/>
+        <w:spacing w:line="240" w:lineRule="auto" w:after="0" w:before="0"/>
+        <w:ind w:firstLine="709"/>
         <w:jc w:val="both"/>
         <w:rPr>
           <w:lang w:val="en-US"/>
@@ -6029,8 +6119,8 @@
         <w:keepLines w:val="0"/>
         <w:pageBreakBefore w:val="0"/>
         <w:widowControl/>
-        <w:spacing w:line="240" w:lineRule="auto" w:after="100" w:before="0"/>
-        <w:ind w:firstLine="425"/>
+        <w:spacing w:line="240" w:lineRule="auto" w:after="0" w:before="0"/>
+        <w:ind w:firstLine="709"/>
         <w:jc w:val="both"/>
         <w:rPr>
           <w:lang w:val="en-US"/>
@@ -6293,8 +6383,8 @@
         <w:keepLines w:val="0"/>
         <w:pageBreakBefore w:val="0"/>
         <w:widowControl/>
-        <w:spacing w:line="240" w:lineRule="auto" w:after="100" w:before="0"/>
-        <w:ind w:firstLine="425"/>
+        <w:spacing w:line="240" w:lineRule="auto" w:after="0" w:before="0"/>
+        <w:ind w:firstLine="709"/>
         <w:jc w:val="both"/>
         <w:rPr>
           <w:lang w:val="en-US"/>
@@ -6317,8 +6407,8 @@
         <w:keepLines w:val="0"/>
         <w:pageBreakBefore w:val="0"/>
         <w:widowControl/>
-        <w:spacing w:line="240" w:lineRule="auto" w:after="100" w:before="0"/>
-        <w:ind w:firstLine="425"/>
+        <w:spacing w:line="240" w:lineRule="auto" w:after="0" w:before="0"/>
+        <w:ind w:firstLine="709"/>
         <w:jc w:val="both"/>
         <w:rPr>
           <w:lang w:val="en-US"/>
@@ -7599,8 +7689,8 @@
         <w:keepLines w:val="0"/>
         <w:pageBreakBefore w:val="0"/>
         <w:widowControl/>
-        <w:spacing w:line="240" w:lineRule="auto" w:after="100" w:before="0"/>
-        <w:ind w:firstLine="425"/>
+        <w:spacing w:line="240" w:lineRule="auto" w:after="0" w:before="0"/>
+        <w:ind w:firstLine="709"/>
         <w:jc w:val="both"/>
         <w:rPr>
           <w:lang w:val="en-US"/>
@@ -7623,8 +7713,8 @@
         <w:keepLines w:val="0"/>
         <w:pageBreakBefore w:val="0"/>
         <w:widowControl/>
-        <w:spacing w:line="240" w:lineRule="auto" w:after="100" w:before="0"/>
-        <w:ind w:firstLine="425"/>
+        <w:spacing w:line="240" w:lineRule="auto" w:after="0" w:before="0"/>
+        <w:ind w:firstLine="709"/>
         <w:jc w:val="both"/>
         <w:rPr>
           <w:lang w:val="en-US"/>
@@ -7647,8 +7737,8 @@
         <w:keepLines w:val="0"/>
         <w:pageBreakBefore w:val="0"/>
         <w:widowControl/>
-        <w:spacing w:line="240" w:lineRule="auto" w:after="100" w:before="0"/>
-        <w:ind w:firstLine="425"/>
+        <w:spacing w:line="240" w:lineRule="auto" w:after="0" w:before="0"/>
+        <w:ind w:firstLine="709"/>
         <w:jc w:val="both"/>
         <w:rPr>
           <w:lang w:val="en-US"/>
@@ -8596,8 +8686,8 @@
         <w:keepLines w:val="0"/>
         <w:pageBreakBefore w:val="0"/>
         <w:widowControl/>
-        <w:spacing w:line="240" w:lineRule="auto" w:after="100" w:before="0"/>
-        <w:ind w:firstLine="425"/>
+        <w:spacing w:line="240" w:lineRule="auto" w:after="0" w:before="0"/>
+        <w:ind w:firstLine="709"/>
         <w:jc w:val="both"/>
         <w:rPr>
           <w:lang w:val="en-US"/>
@@ -10840,8 +10930,8 @@
         <w:keepLines w:val="0"/>
         <w:pageBreakBefore w:val="0"/>
         <w:widowControl/>
-        <w:spacing w:line="240" w:lineRule="auto" w:after="100" w:before="0"/>
-        <w:ind w:firstLine="425"/>
+        <w:spacing w:line="240" w:lineRule="auto" w:after="0" w:before="0"/>
+        <w:ind w:firstLine="709"/>
         <w:jc w:val="both"/>
         <w:rPr>
           <w:lang w:val="en-US"/>
@@ -10889,8 +10979,8 @@
         <w:keepLines w:val="0"/>
         <w:pageBreakBefore w:val="0"/>
         <w:widowControl/>
-        <w:spacing w:line="240" w:lineRule="auto" w:after="100" w:before="0"/>
-        <w:ind w:firstLine="425"/>
+        <w:spacing w:line="240" w:lineRule="auto" w:after="0" w:before="0"/>
+        <w:ind w:firstLine="709"/>
         <w:jc w:val="both"/>
         <w:rPr>
           <w:lang w:val="en-US"/>
@@ -11777,8 +11867,8 @@
         <w:keepLines w:val="0"/>
         <w:pageBreakBefore w:val="0"/>
         <w:widowControl/>
-        <w:spacing w:line="240" w:lineRule="auto" w:after="100" w:before="0"/>
-        <w:ind w:firstLine="425"/>
+        <w:spacing w:line="240" w:lineRule="auto" w:after="0" w:before="0"/>
+        <w:ind w:firstLine="709"/>
         <w:jc w:val="both"/>
         <w:rPr>
           <w:lang w:val="en-US"/>
@@ -11870,8 +11960,8 @@
         <w:keepLines w:val="0"/>
         <w:pageBreakBefore w:val="0"/>
         <w:widowControl/>
-        <w:spacing w:line="240" w:lineRule="auto" w:after="100" w:before="0"/>
-        <w:ind w:firstLine="425"/>
+        <w:spacing w:line="240" w:lineRule="auto" w:after="0" w:before="0"/>
+        <w:ind w:firstLine="709"/>
         <w:jc w:val="both"/>
         <w:rPr>
           <w:lang w:val="en-US"/>
@@ -11988,8 +12078,8 @@
         <w:keepLines w:val="0"/>
         <w:pageBreakBefore w:val="0"/>
         <w:widowControl/>
-        <w:spacing w:line="240" w:lineRule="auto" w:after="100" w:before="0"/>
-        <w:ind w:firstLine="425"/>
+        <w:spacing w:line="240" w:lineRule="auto" w:after="0" w:before="0"/>
+        <w:ind w:firstLine="709"/>
         <w:jc w:val="both"/>
         <w:rPr>
           <w:lang w:val="en-US"/>
@@ -12081,8 +12171,8 @@
         <w:keepLines w:val="0"/>
         <w:pageBreakBefore w:val="0"/>
         <w:widowControl/>
-        <w:spacing w:line="240" w:lineRule="auto" w:after="100" w:before="0"/>
-        <w:ind w:firstLine="425"/>
+        <w:spacing w:line="240" w:lineRule="auto" w:after="0" w:before="0"/>
+        <w:ind w:firstLine="709"/>
         <w:jc w:val="both"/>
         <w:rPr>
           <w:lang w:val="en-US"/>
@@ -12096,7 +12186,7 @@
           <w:color w:val="000000"/>
           <w:sz w:val="24"/>
         </w:rPr>
-        <w:t>The 200 ms outage covers 40 reads. Clearing R1 in C10 gives 98.94% completeness and 98.93% fresh coherent availability; preserving it in C11 gives 99.00% and 98.93%. Figure 6 shows the preselected C10 seed-0 trace. Age gaps represent mixed or unavailable state. A slow-source control distinguishes restart policies: on recovery, clear leaves no state while preserve exposes a coherent object aged 1,200 ms.</w:t>
+        <w:t xml:space="preserve">The 200 ms outage covers 40 reads. Clearing R1 in C10 gives 98.94% completeness and 98.93% fresh coherent availability; preserving it in C11 gives 99.00% and 98.93%. Figure 6 shows the C10 seed-0 trace. Age gaps represent mixed or unavailable state. A slow-source control distinguishes restart policies: on recovery, clear leaves no state while preserve exposes a coherent object aged 1,200 ms.</w:t>
       </w:r>
     </w:p>
     <w:p>
@@ -12174,8 +12264,8 @@
         <w:keepLines w:val="0"/>
         <w:pageBreakBefore w:val="0"/>
         <w:widowControl/>
-        <w:spacing w:line="240" w:lineRule="auto" w:after="100" w:before="0"/>
-        <w:ind w:firstLine="425"/>
+        <w:spacing w:line="240" w:lineRule="auto" w:after="0" w:before="0"/>
+        <w:ind w:firstLine="709"/>
         <w:jc w:val="both"/>
         <w:rPr>
           <w:lang w:val="en-US"/>
@@ -12220,8 +12310,8 @@
         <w:keepLines w:val="0"/>
         <w:pageBreakBefore w:val="0"/>
         <w:widowControl/>
-        <w:spacing w:line="240" w:lineRule="auto" w:after="100" w:before="0"/>
-        <w:ind w:firstLine="425"/>
+        <w:spacing w:line="240" w:lineRule="auto" w:after="0" w:before="0"/>
+        <w:ind w:firstLine="709"/>
         <w:jc w:val="both"/>
         <w:rPr>
           <w:lang w:val="en-US"/>
@@ -12244,8 +12334,8 @@
         <w:keepLines w:val="0"/>
         <w:pageBreakBefore w:val="0"/>
         <w:widowControl/>
-        <w:spacing w:line="240" w:lineRule="auto" w:after="100" w:before="0"/>
-        <w:ind w:firstLine="425"/>
+        <w:spacing w:line="240" w:lineRule="auto" w:after="0" w:before="0"/>
+        <w:ind w:firstLine="709"/>
         <w:jc w:val="both"/>
         <w:rPr>
           <w:lang w:val="en-US"/>
@@ -12268,8 +12358,8 @@
         <w:keepLines w:val="0"/>
         <w:pageBreakBefore w:val="0"/>
         <w:widowControl/>
-        <w:spacing w:line="240" w:lineRule="auto" w:after="100" w:before="0"/>
-        <w:ind w:firstLine="425"/>
+        <w:spacing w:line="240" w:lineRule="auto" w:after="0" w:before="0"/>
+        <w:ind w:firstLine="709"/>
         <w:jc w:val="both"/>
         <w:rPr>
           <w:lang w:val="en-US"/>
@@ -12314,8 +12404,8 @@
         <w:keepLines w:val="1"/>
         <w:pageBreakBefore w:val="0"/>
         <w:widowControl/>
-        <w:spacing w:line="240" w:lineRule="auto" w:after="100" w:before="0"/>
-        <w:ind w:firstLine="425"/>
+        <w:spacing w:line="240" w:lineRule="auto" w:after="0" w:before="0"/>
+        <w:ind w:firstLine="709"/>
         <w:jc w:val="both"/>
         <w:rPr>
           <w:lang w:val="en-US"/>
@@ -12360,8 +12450,8 @@
         <w:keepLines w:val="0"/>
         <w:pageBreakBefore w:val="0"/>
         <w:widowControl/>
-        <w:spacing w:line="240" w:lineRule="auto" w:after="100" w:before="0"/>
-        <w:ind w:firstLine="425"/>
+        <w:spacing w:line="240" w:lineRule="auto" w:after="0" w:before="0"/>
+        <w:ind w:firstLine="709"/>
         <w:jc w:val="both"/>
         <w:rPr>
           <w:lang w:val="en-US"/>
@@ -12375,7 +12465,7 @@
           <w:color w:val="000000"/>
           <w:sz w:val="24"/>
         </w:rPr>
-        <w:t xml:space="preserve">Code and synthetic data are available in the private GitHub repository </w:t>
+        <w:t xml:space="preserve">Code and synthetic data are archived in the private GitHub repository </w:t>
       </w:r>
       <w:hyperlink r:id="rIdArticle1Reproducibility">
         <w:r>
@@ -12385,7 +12475,6 @@
             <w:i w:val="0"/>
             <w:color w:val="000000"/>
             <w:sz w:val="24"/>
-            <w:u w:val="single"/>
           </w:rPr>
           <w:t xml:space="preserve">https://github.com/aizexss/unidirectional</w:t>
         </w:r>
@@ -12398,7 +12487,7 @@
           <w:color w:val="000000"/>
           <w:sz w:val="24"/>
         </w:rPr>
-        <w:t xml:space="preserve">, under tag article1-revision-20261029. Repository access is restricted; a reviewer needs collaborator access to retrieve the materials. The repository contains the exact source histories, compressed log of 3,840,000 scheduled reads, metrics, finite models, independent validators and SHA-256 file manifests (Table 8).</w:t>
+        <w:t xml:space="preserve">, under tag article1-verified-20261029 [20]. A reviewer needs repository access or the companion archive. The materials include source histories, the complete reading log, metrics, models, independent validators and SHA-256 manifests (Table 8).</w:t>
       </w:r>
     </w:p>
     <w:p>
@@ -12407,8 +12496,8 @@
         <w:keepLines w:val="0"/>
         <w:pageBreakBefore w:val="0"/>
         <w:widowControl/>
-        <w:spacing w:line="240" w:lineRule="auto" w:after="100" w:before="0"/>
-        <w:ind w:firstLine="425"/>
+        <w:spacing w:line="240" w:lineRule="auto" w:after="0" w:before="0"/>
+        <w:ind w:firstLine="709"/>
         <w:jc w:val="both"/>
         <w:rPr>
           <w:lang w:val="en-US"/>
@@ -12422,7 +12511,7 @@
           <w:color w:val="000000"/>
           <w:sz w:val="24"/>
         </w:rPr>
-        <w:t>Python 3.10 or later and the standard library suffice. From a writable clone, run python reproduce.py --verify-only to verify supplied data, or python reproduce.py --full to regenerate the study and then validate it. The runner prints numbered stages and writes reports/RESULTS.md and reports/verification_summary.json with pass/fail status, denominators and principal results. Separate implementations reconstruct the reading log and the arrival timeline without importing the simulator.</w:t>
+        <w:t xml:space="preserve">Python 3.10 or later and the standard library suffice. Run python reproduce.py --verify-only to check supplied evidence, or python reproduce.py --full to regenerate numerical outputs from a temporary copy with previous results removed. Numbered stages write reports/RESULTS.md and reports/verification_summary.json. Independent checks reconstruct every read tuple from event schedules and compare numerical tables and figure files with this manuscript.</w:t>
       </w:r>
     </w:p>
     <w:p>
@@ -12431,8 +12520,8 @@
         <w:keepLines w:val="0"/>
         <w:pageBreakBefore w:val="0"/>
         <w:widowControl/>
-        <w:spacing w:line="240" w:lineRule="auto" w:after="100" w:before="0"/>
-        <w:ind w:firstLine="425"/>
+        <w:spacing w:line="240" w:lineRule="auto" w:after="0" w:before="0"/>
+        <w:ind w:firstLine="709"/>
         <w:jc w:val="both"/>
         <w:rPr>
           <w:lang w:val="en-US"/>
@@ -12446,7 +12535,7 @@
           <w:color w:val="000000"/>
           <w:sz w:val="24"/>
         </w:rPr>
-        <w:t>The manifest identifies the distributed files and the Git tag fixes the study revision. A full rerun compares regenerated numeric outputs and decompressed readings with the supplied reference; gzip container timestamps may vary. Figures are supplied exports. Their regeneration and physical-equipment measurements are outside this computational rerun.</w:t>
+        <w:t xml:space="preserve">Full reproduction compares newly created CSV/JSON files and decompressed readings with the reference. All six manuscript images are supplied as exact exports and checked byte for byte; the runner does not redraw the figures. The pump example is illustrative, and physical-equipment measurements are outside this computational reproduction.</w:t>
       </w:r>
     </w:p>
     <w:p>
@@ -13472,11 +13561,11 @@
       <w:r>
         <w:rPr>
           <w:rFonts w:eastAsia="Times New Roman" w:ascii="Times New Roman" w:hAnsi="Times New Roman"/>
-          <w:i/>
           <w:color w:val="000000"/>
           <w:sz w:val="22"/>
-        </w:rPr>
-        <w:t>Guide to operational technology (OT) security</w:t>
+          <w:i/>
+        </w:rPr>
+        <w:t xml:space="preserve">Guide to operational technology (OT) security</w:t>
       </w:r>
       <w:r>
         <w:rPr>
@@ -13506,11 +13595,11 @@
       <w:r>
         <w:rPr>
           <w:rFonts w:eastAsia="Times New Roman" w:ascii="Times New Roman" w:hAnsi="Times New Roman"/>
-          <w:i/>
           <w:color w:val="000000"/>
           <w:sz w:val="22"/>
-        </w:rPr>
-        <w:t>Sensors, 24</w:t>
+          <w:i/>
+        </w:rPr>
+        <w:t xml:space="preserve">Sensors, 24</w:t>
       </w:r>
       <w:r>
         <w:rPr>
@@ -13518,7 +13607,7 @@
           <w:color w:val="000000"/>
           <w:sz w:val="22"/>
         </w:rPr>
-        <w:t>(20), Article 6537. https://doi.org/10.3390/s24206537</w:t>
+        <w:t xml:space="preserve">(20), Article 6537. https://doi.org/10.3390/s24206537</w:t>
       </w:r>
     </w:p>
     <w:p>
@@ -13535,24 +13624,24 @@
           <w:color w:val="000000"/>
           <w:sz w:val="22"/>
         </w:rPr>
-        <w:t xml:space="preserve">[3] Afek, Y., Attiya, H., Dolev, D., Gafni, E., Merritt, M., &amp; Shavit, N. (1993). Atomic snapshots of shared memory. </w:t>
-      </w:r>
-      <w:r>
-        <w:rPr>
-          <w:rFonts w:eastAsia="Times New Roman" w:ascii="Times New Roman" w:hAnsi="Times New Roman"/>
-          <w:i/>
-          <w:color w:val="000000"/>
-          <w:sz w:val="22"/>
-        </w:rPr>
-        <w:t>Journal of the ACM, 40</w:t>
+        <w:t xml:space="preserve">[3] Herlihy, M., Shavit, N., Luchangco, V., &amp; Spear, M. (2020). </w:t>
       </w:r>
       <w:r>
         <w:rPr>
           <w:rFonts w:eastAsia="Times New Roman" w:ascii="Times New Roman" w:hAnsi="Times New Roman"/>
           <w:color w:val="000000"/>
           <w:sz w:val="22"/>
-        </w:rPr>
-        <w:t>(4), 873–890. https://doi.org/10.1145/153724.153741</w:t>
+          <w:i/>
+        </w:rPr>
+        <w:t xml:space="preserve">The art of multiprocessor programming</w:t>
+      </w:r>
+      <w:r>
+        <w:rPr>
+          <w:rFonts w:eastAsia="Times New Roman" w:ascii="Times New Roman" w:hAnsi="Times New Roman"/>
+          <w:color w:val="000000"/>
+          <w:sz w:val="22"/>
+        </w:rPr>
+        <w:t xml:space="preserve"> (2nd ed.). Morgan Kaufmann. https://www.sciencedirect.com/book/9780124159501/the-art-of-multiprocessor-programming</w:t>
       </w:r>
     </w:p>
     <w:p>
@@ -13569,24 +13658,24 @@
           <w:color w:val="000000"/>
           <w:sz w:val="22"/>
         </w:rPr>
-        <w:t xml:space="preserve">[4] Herlihy, M. P., &amp; Wing, J. M. (1990). Linearizability: A correctness condition for concurrent objects. </w:t>
-      </w:r>
-      <w:r>
-        <w:rPr>
-          <w:rFonts w:eastAsia="Times New Roman" w:ascii="Times New Roman" w:hAnsi="Times New Roman"/>
-          <w:i/>
-          <w:color w:val="000000"/>
-          <w:sz w:val="22"/>
-        </w:rPr>
-        <w:t>ACM Transactions on Programming Languages and Systems, 12</w:t>
+        <w:t xml:space="preserve">[4] van Steen, M., &amp; Tanenbaum, A. S. (2023). </w:t>
       </w:r>
       <w:r>
         <w:rPr>
           <w:rFonts w:eastAsia="Times New Roman" w:ascii="Times New Roman" w:hAnsi="Times New Roman"/>
           <w:color w:val="000000"/>
           <w:sz w:val="22"/>
-        </w:rPr>
-        <w:t>(3), 463–492. https://doi.org/10.1145/78969.78972</w:t>
+          <w:i/>
+        </w:rPr>
+        <w:t xml:space="preserve">Distributed systems</w:t>
+      </w:r>
+      <w:r>
+        <w:rPr>
+          <w:rFonts w:eastAsia="Times New Roman" w:ascii="Times New Roman" w:hAnsi="Times New Roman"/>
+          <w:color w:val="000000"/>
+          <w:sz w:val="22"/>
+        </w:rPr>
+        <w:t xml:space="preserve"> (4th ed.). distributed-systems.net. https://www.distributed-systems.net/index.php/books/ds4/</w:t>
       </w:r>
     </w:p>
     <w:p>
@@ -13603,24 +13692,24 @@
           <w:color w:val="000000"/>
           <w:sz w:val="22"/>
         </w:rPr>
-        <w:t xml:space="preserve">[5] Chandy, K. M., &amp; Lamport, L. (1985). Distributed snapshots: Determining global states of distributed systems. </w:t>
-      </w:r>
-      <w:r>
-        <w:rPr>
-          <w:rFonts w:eastAsia="Times New Roman" w:ascii="Times New Roman" w:hAnsi="Times New Roman"/>
-          <w:i/>
-          <w:color w:val="000000"/>
-          <w:sz w:val="22"/>
-        </w:rPr>
-        <w:t>ACM Transactions on Computer Systems, 3</w:t>
+        <w:t xml:space="preserve">[5] Basin, D., Klaedtke, F., &amp; Zălinescu, E. (2020). Runtime verification over out-of-order streams. </w:t>
       </w:r>
       <w:r>
         <w:rPr>
           <w:rFonts w:eastAsia="Times New Roman" w:ascii="Times New Roman" w:hAnsi="Times New Roman"/>
           <w:color w:val="000000"/>
           <w:sz w:val="22"/>
-        </w:rPr>
-        <w:t>(1), 63–75. https://doi.org/10.1145/214451.214456</w:t>
+          <w:i/>
+        </w:rPr>
+        <w:t xml:space="preserve">ACM Transactions on Computational Logic, 21</w:t>
+      </w:r>
+      <w:r>
+        <w:rPr>
+          <w:rFonts w:eastAsia="Times New Roman" w:ascii="Times New Roman" w:hAnsi="Times New Roman"/>
+          <w:color w:val="000000"/>
+          <w:sz w:val="22"/>
+        </w:rPr>
+        <w:t xml:space="preserve">(1), Article 5. https://doi.org/10.1145/3355609</w:t>
       </w:r>
     </w:p>
     <w:p>
@@ -13637,24 +13726,24 @@
           <w:color w:val="000000"/>
           <w:sz w:val="22"/>
         </w:rPr>
-        <w:t xml:space="preserve">[6] Lamport, L. (1978). Time, clocks, and the ordering of events in a distributed system. </w:t>
-      </w:r>
-      <w:r>
-        <w:rPr>
-          <w:rFonts w:eastAsia="Times New Roman" w:ascii="Times New Roman" w:hAnsi="Times New Roman"/>
-          <w:i/>
-          <w:color w:val="000000"/>
-          <w:sz w:val="22"/>
-        </w:rPr>
-        <w:t>Communications of the ACM, 21</w:t>
+        <w:t xml:space="preserve">[6] Bartocci, E., Falcone, Y., Francalanza, A., &amp; Reger, G. (2018). Introduction to runtime verification. In E. Bartocci &amp; Y. Falcone (Eds.), </w:t>
       </w:r>
       <w:r>
         <w:rPr>
           <w:rFonts w:eastAsia="Times New Roman" w:ascii="Times New Roman" w:hAnsi="Times New Roman"/>
           <w:color w:val="000000"/>
           <w:sz w:val="22"/>
-        </w:rPr>
-        <w:t>(7), 558–565. https://doi.org/10.1145/359545.359563</w:t>
+          <w:i/>
+        </w:rPr>
+        <w:t xml:space="preserve">Lectures on runtime verification</w:t>
+      </w:r>
+      <w:r>
+        <w:rPr>
+          <w:rFonts w:eastAsia="Times New Roman" w:ascii="Times New Roman" w:hAnsi="Times New Roman"/>
+          <w:color w:val="000000"/>
+          <w:sz w:val="22"/>
+        </w:rPr>
+        <w:t xml:space="preserve"> (pp. 1–33). Springer. https://doi.org/10.1007/978-3-319-75632-5_1</w:t>
       </w:r>
     </w:p>
     <w:p>
@@ -13671,24 +13760,24 @@
           <w:color w:val="000000"/>
           <w:sz w:val="22"/>
         </w:rPr>
-        <w:t xml:space="preserve">[7] Bauer, A., Leucker, M., &amp; Schallhart, C. (2011). Runtime verification for LTL and TLTL. </w:t>
-      </w:r>
-      <w:r>
-        <w:rPr>
-          <w:rFonts w:eastAsia="Times New Roman" w:ascii="Times New Roman" w:hAnsi="Times New Roman"/>
-          <w:i/>
-          <w:color w:val="000000"/>
-          <w:sz w:val="22"/>
-        </w:rPr>
-        <w:t>ACM Transactions on Software Engineering and Methodology, 20</w:t>
+        <w:t xml:space="preserve">[7] Cimatti, A., Grosen, T. M., Larsen, K. G., Tonetta, S., &amp; Zimmermann, M. (2026). Exploiting assumptions for effective monitoring of real-time properties under partial observability. </w:t>
       </w:r>
       <w:r>
         <w:rPr>
           <w:rFonts w:eastAsia="Times New Roman" w:ascii="Times New Roman" w:hAnsi="Times New Roman"/>
           <w:color w:val="000000"/>
           <w:sz w:val="22"/>
-        </w:rPr>
-        <w:t>(4), Article 14. https://doi.org/10.1145/2000799.2000800</w:t>
+          <w:i/>
+        </w:rPr>
+        <w:t xml:space="preserve">Software and Systems Modeling</w:t>
+      </w:r>
+      <w:r>
+        <w:rPr>
+          <w:rFonts w:eastAsia="Times New Roman" w:ascii="Times New Roman" w:hAnsi="Times New Roman"/>
+          <w:color w:val="000000"/>
+          <w:sz w:val="22"/>
+        </w:rPr>
+        <w:t xml:space="preserve">. Advance online publication. https://doi.org/10.1007/s10270-026-01394-6</w:t>
       </w:r>
     </w:p>
     <w:p>
@@ -13705,24 +13794,24 @@
           <w:color w:val="000000"/>
           <w:sz w:val="22"/>
         </w:rPr>
-        <w:t xml:space="preserve">[8] Cimatti, A., Grosen, T. M., Larsen, K. G., Tonetta, S., &amp; Zimmermann, M. (2026). Exploiting assumptions for effective monitoring of real-time properties under partial observability. </w:t>
-      </w:r>
-      <w:r>
-        <w:rPr>
-          <w:rFonts w:eastAsia="Times New Roman" w:ascii="Times New Roman" w:hAnsi="Times New Roman"/>
-          <w:i/>
-          <w:color w:val="000000"/>
-          <w:sz w:val="22"/>
-        </w:rPr>
-        <w:t>Software and Systems Modeling</w:t>
+        <w:t xml:space="preserve">[8] Kallwies, H., Leucker, M., &amp; Sánchez, C. (2022). </w:t>
       </w:r>
       <w:r>
         <w:rPr>
           <w:rFonts w:eastAsia="Times New Roman" w:ascii="Times New Roman" w:hAnsi="Times New Roman"/>
           <w:color w:val="000000"/>
           <w:sz w:val="22"/>
-        </w:rPr>
-        <w:t>. Advance online publication. https://doi.org/10.1007/s10270-026-01394-6</w:t>
+          <w:i/>
+        </w:rPr>
+        <w:t xml:space="preserve">Symbolic runtime verification for monitoring under uncertainties and assumptions</w:t>
+      </w:r>
+      <w:r>
+        <w:rPr>
+          <w:rFonts w:eastAsia="Times New Roman" w:ascii="Times New Roman" w:hAnsi="Times New Roman"/>
+          <w:color w:val="000000"/>
+          <w:sz w:val="22"/>
+        </w:rPr>
+        <w:t xml:space="preserve"> [Preprint]. arXiv. https://doi.org/10.48550/arXiv.2207.05678</w:t>
       </w:r>
     </w:p>
     <w:p>
@@ -13739,24 +13828,24 @@
           <w:color w:val="000000"/>
           <w:sz w:val="22"/>
         </w:rPr>
-        <w:t xml:space="preserve">[9] OPC Foundation. (2025). </w:t>
-      </w:r>
-      <w:r>
-        <w:rPr>
-          <w:rFonts w:eastAsia="Times New Roman" w:ascii="Times New Roman" w:hAnsi="Times New Roman"/>
-          <w:i/>
-          <w:color w:val="000000"/>
-          <w:sz w:val="22"/>
-        </w:rPr>
-        <w:t>OPC Unified Architecture Part 25: Object Serialization</w:t>
+        <w:t xml:space="preserve">[9] OPC Foundation. (n.d.). </w:t>
       </w:r>
       <w:r>
         <w:rPr>
           <w:rFonts w:eastAsia="Times New Roman" w:ascii="Times New Roman" w:hAnsi="Times New Roman"/>
           <w:color w:val="000000"/>
           <w:sz w:val="22"/>
-        </w:rPr>
-        <w:t xml:space="preserve"> (Version 1.05.06, Sections 4.5 and 5.1). https://reference.opcfoundation.org/specs/OPC-10000-25/4.5; https://reference.opcfoundation.org/specs/OPC-10000-25/5.1</w:t>
+          <w:i/>
+        </w:rPr>
+        <w:t xml:space="preserve">OPC Unified Architecture Part 25: Object Serialization</w:t>
+      </w:r>
+      <w:r>
+        <w:rPr>
+          <w:rFonts w:eastAsia="Times New Roman" w:ascii="Times New Roman" w:hAnsi="Times New Roman"/>
+          <w:color w:val="000000"/>
+          <w:sz w:val="22"/>
+        </w:rPr>
+        <w:t xml:space="preserve"> (Section 4.5). Retrieved October 29, 2026, from https://reference.opcfoundation.org/specs/OPC-10000-25/4.5</w:t>
       </w:r>
     </w:p>
     <w:p>
@@ -13773,24 +13862,24 @@
           <w:color w:val="000000"/>
           <w:sz w:val="22"/>
         </w:rPr>
-        <w:t xml:space="preserve">[10] OPC Foundation. (2025). </w:t>
-      </w:r>
-      <w:r>
-        <w:rPr>
-          <w:rFonts w:eastAsia="Times New Roman" w:ascii="Times New Roman" w:hAnsi="Times New Roman"/>
-          <w:i/>
-          <w:color w:val="000000"/>
-          <w:sz w:val="22"/>
-        </w:rPr>
-        <w:t>OPC Unified Architecture Part 14: PubSub</w:t>
+        <w:t xml:space="preserve">[10] OPC Foundation. (n.d.). </w:t>
       </w:r>
       <w:r>
         <w:rPr>
           <w:rFonts w:eastAsia="Times New Roman" w:ascii="Times New Roman" w:hAnsi="Times New Roman"/>
           <w:color w:val="000000"/>
           <w:sz w:val="22"/>
-        </w:rPr>
-        <w:t xml:space="preserve"> (Version 1.05.06, Section 5.3.3). https://reference.opcfoundation.org/specs/OPC-10000-14/5.3.3</w:t>
+          <w:i/>
+        </w:rPr>
+        <w:t xml:space="preserve">OPC Unified Architecture Part 14: PubSub</w:t>
+      </w:r>
+      <w:r>
+        <w:rPr>
+          <w:rFonts w:eastAsia="Times New Roman" w:ascii="Times New Roman" w:hAnsi="Times New Roman"/>
+          <w:color w:val="000000"/>
+          <w:sz w:val="22"/>
+        </w:rPr>
+        <w:t xml:space="preserve"> (Section 5.3.3). Retrieved October 29, 2026, from https://reference.opcfoundation.org/specs/OPC-10000-14/5.3.3</w:t>
       </w:r>
     </w:p>
     <w:p>
@@ -13807,24 +13896,24 @@
           <w:color w:val="000000"/>
           <w:sz w:val="22"/>
         </w:rPr>
-        <w:t xml:space="preserve">[11] Kaul, S., Yates, R., &amp; Gruteser, M. (2012). Real-time status: How often should one update? In </w:t>
-      </w:r>
-      <w:r>
-        <w:rPr>
-          <w:rFonts w:eastAsia="Times New Roman" w:ascii="Times New Roman" w:hAnsi="Times New Roman"/>
-          <w:i/>
-          <w:color w:val="000000"/>
-          <w:sz w:val="22"/>
-        </w:rPr>
-        <w:t>Proceedings of IEEE INFOCOM</w:t>
+        <w:t xml:space="preserve">[11] OPC Foundation. (n.d.). </w:t>
       </w:r>
       <w:r>
         <w:rPr>
           <w:rFonts w:eastAsia="Times New Roman" w:ascii="Times New Roman" w:hAnsi="Times New Roman"/>
           <w:color w:val="000000"/>
           <w:sz w:val="22"/>
-        </w:rPr>
-        <w:t xml:space="preserve"> (pp. 2731–2735). IEEE. https://doi.org/10.1109/INFCOM.2012.6195689</w:t>
+          <w:i/>
+        </w:rPr>
+        <w:t xml:space="preserve">OPC Unified Architecture Part 3: Address Space Model</w:t>
+      </w:r>
+      <w:r>
+        <w:rPr>
+          <w:rFonts w:eastAsia="Times New Roman" w:ascii="Times New Roman" w:hAnsi="Times New Roman"/>
+          <w:color w:val="000000"/>
+          <w:sz w:val="22"/>
+        </w:rPr>
+        <w:t xml:space="preserve"> (Section 8.58). Retrieved October 29, 2026, from https://reference.opcfoundation.org/specs/OPC-10000-3/8.58</w:t>
       </w:r>
     </w:p>
     <w:p>
@@ -13841,24 +13930,24 @@
           <w:color w:val="000000"/>
           <w:sz w:val="22"/>
         </w:rPr>
-        <w:t xml:space="preserve">[12] Gilbert, E. N. (1960). Capacity of a burst-noise channel. </w:t>
-      </w:r>
-      <w:r>
-        <w:rPr>
-          <w:rFonts w:eastAsia="Times New Roman" w:ascii="Times New Roman" w:hAnsi="Times New Roman"/>
-          <w:i/>
-          <w:color w:val="000000"/>
-          <w:sz w:val="22"/>
-        </w:rPr>
-        <w:t>Bell System Technical Journal, 39</w:t>
+        <w:t xml:space="preserve">[12] OPC Foundation. (n.d.). </w:t>
       </w:r>
       <w:r>
         <w:rPr>
           <w:rFonts w:eastAsia="Times New Roman" w:ascii="Times New Roman" w:hAnsi="Times New Roman"/>
           <w:color w:val="000000"/>
           <w:sz w:val="22"/>
-        </w:rPr>
-        <w:t>(5), 1253–1265. https://doi.org/10.1002/j.1538-7305.1960.tb03959.x</w:t>
+          <w:i/>
+        </w:rPr>
+        <w:t xml:space="preserve">OPC Unified Architecture Part 4: Services</w:t>
+      </w:r>
+      <w:r>
+        <w:rPr>
+          <w:rFonts w:eastAsia="Times New Roman" w:ascii="Times New Roman" w:hAnsi="Times New Roman"/>
+          <w:color w:val="000000"/>
+          <w:sz w:val="22"/>
+        </w:rPr>
+        <w:t xml:space="preserve"> (Section 5.11.2). Retrieved October 29, 2026, from https://reference.opcfoundation.org/specs/OPC-10000-4/5.11.2</w:t>
       </w:r>
     </w:p>
     <w:p>
@@ -13875,24 +13964,24 @@
           <w:color w:val="000000"/>
           <w:sz w:val="22"/>
         </w:rPr>
-        <w:t xml:space="preserve">[13] L’Ecuyer, P., Simard, R., Chen, E. J., &amp; Kelton, W. D. (2002). An object-oriented random-number package with many long streams and substreams. </w:t>
-      </w:r>
-      <w:r>
-        <w:rPr>
-          <w:rFonts w:eastAsia="Times New Roman" w:ascii="Times New Roman" w:hAnsi="Times New Roman"/>
-          <w:i/>
-          <w:color w:val="000000"/>
-          <w:sz w:val="22"/>
-        </w:rPr>
-        <w:t>Operations Research, 50</w:t>
+        <w:t xml:space="preserve">[13] Yates, R. D., Sun, Y., Brown, D. R., III, Kaul, S. K., Modiano, E., &amp; Ulukus, S. (2021). Age of information: An introduction and survey. </w:t>
       </w:r>
       <w:r>
         <w:rPr>
           <w:rFonts w:eastAsia="Times New Roman" w:ascii="Times New Roman" w:hAnsi="Times New Roman"/>
           <w:color w:val="000000"/>
           <w:sz w:val="22"/>
-        </w:rPr>
-        <w:t>(6), 1073–1075. https://doi.org/10.1287/opre.50.6.1073.358</w:t>
+          <w:i/>
+        </w:rPr>
+        <w:t xml:space="preserve">IEEE Journal on Selected Areas in Communications, 39</w:t>
+      </w:r>
+      <w:r>
+        <w:rPr>
+          <w:rFonts w:eastAsia="Times New Roman" w:ascii="Times New Roman" w:hAnsi="Times New Roman"/>
+          <w:color w:val="000000"/>
+          <w:sz w:val="22"/>
+        </w:rPr>
+        <w:t xml:space="preserve">(5), 1183–1210. https://doi.org/10.1109/JSAC.2021.3065072</w:t>
       </w:r>
     </w:p>
     <w:p>
@@ -13909,24 +13998,24 @@
           <w:color w:val="000000"/>
           <w:sz w:val="22"/>
         </w:rPr>
-        <w:t xml:space="preserve">[14] Efron, B. (1979). Bootstrap methods: Another look at the jackknife. </w:t>
-      </w:r>
-      <w:r>
-        <w:rPr>
-          <w:rFonts w:eastAsia="Times New Roman" w:ascii="Times New Roman" w:hAnsi="Times New Roman"/>
-          <w:i/>
-          <w:color w:val="000000"/>
-          <w:sz w:val="22"/>
-        </w:rPr>
-        <w:t>The Annals of Statistics, 7</w:t>
+        <w:t xml:space="preserve">[14] Li, H., Tang, L., Chen, S., Zheng, L., &amp; Zhong, S. (2024). AoI-aware resource scheduling for industrial IoT with deep reinforcement learning. </w:t>
       </w:r>
       <w:r>
         <w:rPr>
           <w:rFonts w:eastAsia="Times New Roman" w:ascii="Times New Roman" w:hAnsi="Times New Roman"/>
           <w:color w:val="000000"/>
           <w:sz w:val="22"/>
-        </w:rPr>
-        <w:t>(1), 1–26. https://doi.org/10.1214/aos/1176344552</w:t>
+          <w:i/>
+        </w:rPr>
+        <w:t xml:space="preserve">Electronics, 13</w:t>
+      </w:r>
+      <w:r>
+        <w:rPr>
+          <w:rFonts w:eastAsia="Times New Roman" w:ascii="Times New Roman" w:hAnsi="Times New Roman"/>
+          <w:color w:val="000000"/>
+          <w:sz w:val="22"/>
+        </w:rPr>
+        <w:t xml:space="preserve">(6), Article 1104. https://doi.org/10.3390/electronics13061104</w:t>
       </w:r>
     </w:p>
     <w:p>
@@ -13943,24 +14032,194 @@
           <w:color w:val="000000"/>
           <w:sz w:val="22"/>
         </w:rPr>
-        <w:t xml:space="preserve">[15] Sargent, R. G. (2013). Verification and validation of simulation models. </w:t>
-      </w:r>
-      <w:r>
-        <w:rPr>
-          <w:rFonts w:eastAsia="Times New Roman" w:ascii="Times New Roman" w:hAnsi="Times New Roman"/>
-          <w:i/>
-          <w:color w:val="000000"/>
-          <w:sz w:val="22"/>
-        </w:rPr>
-        <w:t>Journal of Simulation, 7</w:t>
+        <w:t xml:space="preserve">[15] L’Ecuyer, P. (2017, February). </w:t>
       </w:r>
       <w:r>
         <w:rPr>
           <w:rFonts w:eastAsia="Times New Roman" w:ascii="Times New Roman" w:hAnsi="Times New Roman"/>
           <w:color w:val="000000"/>
           <w:sz w:val="22"/>
-        </w:rPr>
-        <w:t>(1), 12–24. https://doi.org/10.1057/jos.2012.20</w:t>
+          <w:i/>
+        </w:rPr>
+        <w:t xml:space="preserve">Random number generation with multiple streams for sequential and parallel computing</w:t>
+      </w:r>
+      <w:r>
+        <w:rPr>
+          <w:rFonts w:eastAsia="Times New Roman" w:ascii="Times New Roman" w:hAnsi="Times New Roman"/>
+          <w:color w:val="000000"/>
+          <w:sz w:val="22"/>
+        </w:rPr>
+        <w:t xml:space="preserve"> [Lecture slides]. Université de Montréal. https://www-labs.iro.umontreal.ca/~lecuyer/myftp/slides/parallel-rng-mit17.pdf</w:t>
+      </w:r>
+    </w:p>
+    <w:p>
+      <w:pPr>
+        <w:keepNext w:val="0"/>
+        <w:keepLines/>
+        <w:spacing w:before="0" w:after="80" w:line="240" w:lineRule="auto"/>
+        <w:ind w:left="369" w:hanging="369"/>
+        <w:jc w:val="left"/>
+      </w:pPr>
+      <w:r>
+        <w:rPr>
+          <w:rFonts w:eastAsia="Times New Roman" w:ascii="Times New Roman" w:hAnsi="Times New Roman"/>
+          <w:color w:val="000000"/>
+          <w:sz w:val="22"/>
+        </w:rPr>
+        <w:t xml:space="preserve">[16] Python Software Foundation. (n.d.). </w:t>
+      </w:r>
+      <w:r>
+        <w:rPr>
+          <w:rFonts w:eastAsia="Times New Roman" w:ascii="Times New Roman" w:hAnsi="Times New Roman"/>
+          <w:color w:val="000000"/>
+          <w:sz w:val="22"/>
+          <w:i/>
+        </w:rPr>
+        <w:t xml:space="preserve">random — Generate pseudo-random numbers</w:t>
+      </w:r>
+      <w:r>
+        <w:rPr>
+          <w:rFonts w:eastAsia="Times New Roman" w:ascii="Times New Roman" w:hAnsi="Times New Roman"/>
+          <w:color w:val="000000"/>
+          <w:sz w:val="22"/>
+        </w:rPr>
+        <w:t xml:space="preserve">. Python 3.12 documentation. Retrieved October 29, 2026, from https://docs.python.org/3.12/library/random.html</w:t>
+      </w:r>
+    </w:p>
+    <w:p>
+      <w:pPr>
+        <w:keepNext w:val="0"/>
+        <w:keepLines/>
+        <w:spacing w:before="0" w:after="80" w:line="240" w:lineRule="auto"/>
+        <w:ind w:left="369" w:hanging="369"/>
+        <w:jc w:val="left"/>
+      </w:pPr>
+      <w:r>
+        <w:rPr>
+          <w:rFonts w:eastAsia="Times New Roman" w:ascii="Times New Roman" w:hAnsi="Times New Roman"/>
+          <w:color w:val="000000"/>
+          <w:sz w:val="22"/>
+        </w:rPr>
+        <w:t xml:space="preserve">[17] Efron, B., &amp; Narasimhan, B. (2020). The automatic construction of bootstrap confidence intervals. </w:t>
+      </w:r>
+      <w:r>
+        <w:rPr>
+          <w:rFonts w:eastAsia="Times New Roman" w:ascii="Times New Roman" w:hAnsi="Times New Roman"/>
+          <w:color w:val="000000"/>
+          <w:sz w:val="22"/>
+          <w:i/>
+        </w:rPr>
+        <w:t xml:space="preserve">Journal of Computational and Graphical Statistics, 29</w:t>
+      </w:r>
+      <w:r>
+        <w:rPr>
+          <w:rFonts w:eastAsia="Times New Roman" w:ascii="Times New Roman" w:hAnsi="Times New Roman"/>
+          <w:color w:val="000000"/>
+          <w:sz w:val="22"/>
+        </w:rPr>
+        <w:t xml:space="preserve">(3), 608–619. https://doi.org/10.1080/10618600.2020.1714633</w:t>
+      </w:r>
+    </w:p>
+    <w:p>
+      <w:pPr>
+        <w:keepNext w:val="0"/>
+        <w:keepLines/>
+        <w:spacing w:before="0" w:after="80" w:line="240" w:lineRule="auto"/>
+        <w:ind w:left="369" w:hanging="369"/>
+        <w:jc w:val="left"/>
+      </w:pPr>
+      <w:r>
+        <w:rPr>
+          <w:rFonts w:eastAsia="Times New Roman" w:ascii="Times New Roman" w:hAnsi="Times New Roman"/>
+          <w:color w:val="000000"/>
+          <w:sz w:val="22"/>
+        </w:rPr>
+        <w:t xml:space="preserve">[18] Monks, T., Currie, C. S. M., Onggo, B. S., Robinson, S., Kunc, M., &amp; Taylor, S. J. E. (2019). Strengthening the reporting of empirical simulation studies: Introducing the STRESS guidelines. </w:t>
+      </w:r>
+      <w:r>
+        <w:rPr>
+          <w:rFonts w:eastAsia="Times New Roman" w:ascii="Times New Roman" w:hAnsi="Times New Roman"/>
+          <w:color w:val="000000"/>
+          <w:sz w:val="22"/>
+          <w:i/>
+        </w:rPr>
+        <w:t xml:space="preserve">Journal of Simulation, 13</w:t>
+      </w:r>
+      <w:r>
+        <w:rPr>
+          <w:rFonts w:eastAsia="Times New Roman" w:ascii="Times New Roman" w:hAnsi="Times New Roman"/>
+          <w:color w:val="000000"/>
+          <w:sz w:val="22"/>
+        </w:rPr>
+        <w:t xml:space="preserve">(1), 55–67. https://doi.org/10.1080/17477778.2018.1442155</w:t>
+      </w:r>
+    </w:p>
+    <w:p>
+      <w:pPr>
+        <w:keepNext w:val="0"/>
+        <w:keepLines/>
+        <w:spacing w:before="0" w:after="80" w:line="240" w:lineRule="auto"/>
+        <w:ind w:left="369" w:hanging="369"/>
+        <w:jc w:val="left"/>
+      </w:pPr>
+      <w:r>
+        <w:rPr>
+          <w:rFonts w:eastAsia="Times New Roman" w:ascii="Times New Roman" w:hAnsi="Times New Roman"/>
+          <w:color w:val="000000"/>
+          <w:sz w:val="22"/>
+        </w:rPr>
+        <w:t xml:space="preserve">[19] National Academies of Sciences, Engineering, and Medicine. (2019). </w:t>
+      </w:r>
+      <w:r>
+        <w:rPr>
+          <w:rFonts w:eastAsia="Times New Roman" w:ascii="Times New Roman" w:hAnsi="Times New Roman"/>
+          <w:color w:val="000000"/>
+          <w:sz w:val="22"/>
+          <w:i/>
+        </w:rPr>
+        <w:t xml:space="preserve">Reproducibility and replicability in science</w:t>
+      </w:r>
+      <w:r>
+        <w:rPr>
+          <w:rFonts w:eastAsia="Times New Roman" w:ascii="Times New Roman" w:hAnsi="Times New Roman"/>
+          <w:color w:val="000000"/>
+          <w:sz w:val="22"/>
+        </w:rPr>
+        <w:t xml:space="preserve">. The National Academies Press. https://doi.org/10.17226/25303</w:t>
+      </w:r>
+    </w:p>
+    <w:p>
+      <w:pPr>
+        <w:keepNext w:val="0"/>
+        <w:keepLines/>
+        <w:spacing w:before="0" w:after="80" w:line="240" w:lineRule="auto"/>
+        <w:ind w:left="369" w:hanging="369"/>
+        <w:jc w:val="left"/>
+      </w:pPr>
+      <w:r>
+        <w:rPr>
+          <w:rFonts w:eastAsia="Times New Roman" w:ascii="Times New Roman" w:hAnsi="Times New Roman"/>
+          <w:color w:val="000000"/>
+          <w:sz w:val="22"/>
+        </w:rPr>
+        <w:t xml:space="preserve">[20] Ibragimov, A. (2026). </w:t>
+      </w:r>
+      <w:r>
+        <w:rPr>
+          <w:rFonts w:eastAsia="Times New Roman" w:ascii="Times New Roman" w:hAnsi="Times New Roman"/>
+          <w:color w:val="000000"/>
+          <w:sz w:val="22"/>
+          <w:i/>
+        </w:rPr>
+        <w:t xml:space="preserve">Snapshot coherence in unidirectional industrial telemetry</w:t>
+      </w:r>
+      <w:r>
+        <w:rPr>
+          <w:rFonts w:eastAsia="Times New Roman" w:ascii="Times New Roman" w:hAnsi="Times New Roman"/>
+          <w:color w:val="000000"/>
+          <w:sz w:val="22"/>
+        </w:rPr>
+        <w:t xml:space="preserve"> (Version article1-verified-20261029) [Source code and synthetic data]. GitHub. https://github.com/aizexss/unidirectional/tree/article1-verified-20261029</w:t>
       </w:r>
     </w:p>
     <w:sectPr>

</xml_diff>

<commit_message>
Prepare public article materials and remove editorial working files
</commit_message>
<xml_diff>
--- a/manuscript/Ibragimov_Aibar_Article_Revised.docx
+++ b/manuscript/Ibragimov_Aibar_Article_Revised.docx
@@ -12912,7 +12912,7 @@
           <w:sz w:val="24"/>
           <w:szCs w:val="24"/>
         </w:rPr>
-        <w:t xml:space="preserve">Code and synthetic data are archived in the private GitHub repository </w:t>
+        <w:t xml:space="preserve">Code and synthetic data are publicly available at </w:t>
       </w:r>
       <w:hyperlink r:id="rIdArticle1Reproducibility">
         <w:r>
@@ -12936,7 +12936,7 @@
           <w:sz w:val="24"/>
           <w:szCs w:val="24"/>
         </w:rPr>
-        <w:t xml:space="preserve">, under tag article1-verified-20261029 [20]. A reviewer needs repository access or the companion archive. The materials include source histories, the complete reading log, metrics, models, independent validators and SHA-256 manifests (Table 8).</w:t>
+        <w:t xml:space="preserve">, under tag article1-public-20261029 [20]. The materials include source histories, the complete reading log, metrics, models, independent validators and SHA-256 manifests (Table 8).</w:t>
       </w:r>
     </w:p>
     <w:p>
@@ -14760,7 +14760,7 @@
           <w:sz w:val="24"/>
           <w:szCs w:val="24"/>
         </w:rPr>
-        <w:t xml:space="preserve"> (Version article1-verified-20261029) [Source code and synthetic data]. GitHub. https://github.com/aizexss/unidirectional/tree/article1-verified-20261029</w:t>
+        <w:t xml:space="preserve"> (Version article1-public-20261029) [Source code and synthetic data]. GitHub. https://github.com/aizexss/unidirectional/tree/article1-public-20261029</w:t>
       </w:r>
     </w:p>
     <w:sectPr>

</xml_diff>

<commit_message>
docs: shorten disclosure and freeze submission revision
</commit_message>
<xml_diff>
--- a/manuscript/Ibragimov_Aibar_Article_Revised.docx
+++ b/manuscript/Ibragimov_Aibar_Article_Revised.docx
@@ -4464,18 +4464,6 @@
     </w:p>
     <w:p>
       <w:pPr>
-        <w:pStyle w:val="2"/>
-        <w:spacing w:before="140" w:after="80"/>
-      </w:pPr>
-      <w:r>
-        <w:rPr>
-          <w:szCs w:val="24"/>
-        </w:rPr>
-        <w:t>AI-assisted preparation and verification</w:t>
-      </w:r>
-    </w:p>
-    <w:p>
-      <w:pPr>
         <w:ind w:firstLine="709"/>
         <w:jc w:val="both"/>
         <w:rPr>
@@ -4487,7 +4475,7 @@
           <w:szCs w:val="24"/>
           <w:lang w:val="en-US"/>
         </w:rPr>
-        <w:t>OpenAI Codex (model gpt-6.1-sol; accessed 28–30 October 2026) assisted manuscript preparation and revision and the development and review of modelling, plotting, reproduction and validation code. It also assisted formulation of the illustrative pump example. Synthetic data were generated by the documented Python models. Figures are programmatic schematics or plots of analytical expressions and simulation outputs; no text-to-image generator was used. The supplied raw counts were retained; the six figures were redrawn from the same models and numerical outputs. Results and table rounding were checked against executable programs and integer counts. The authors are responsible for the final content and interpretation.</w:t>
+        <w:t>OpenAI Codex supported manuscript preparation and Python scripting for simulation, plotting and verification. The authors are responsible for the final content.</w:t>
       </w:r>
     </w:p>
     <w:p>
@@ -9797,7 +9785,7 @@
           <w:szCs w:val="24"/>
           <w:lang w:val="en-US"/>
         </w:rPr>
-        <w:t>, under tag article1-submission-20261030 [20]. The materials include source histories, the complete reading log, metrics, models, independent validators and SHA-256 manifests (Table 8).</w:t>
+        <w:t>, under tag article1-submission-20261030-r2 [20]. The materials include source histories, the complete reading log, metrics, models, independent validators and SHA-256 manifests (Table 8).</w:t>
       </w:r>
     </w:p>
     <w:p>
@@ -11429,14 +11417,14 @@
           <w:szCs w:val="24"/>
           <w:lang w:val="en-US"/>
         </w:rPr>
-        <w:t xml:space="preserve"> (Version article1-submission-20261030) [Source code and synthetic data]. </w:t>
+        <w:t xml:space="preserve"> (Version article1-submission-20261030-r2) [Source code and synthetic data]. </w:t>
       </w:r>
       <w:r>
         <w:rPr>
           <w:rFonts w:eastAsia="Times New Roman"/>
           <w:szCs w:val="24"/>
         </w:rPr>
-        <w:t>GitHub. https://github.com/aizexss/unidirectional/tree/article1-submission-20261030</w:t>
+        <w:t>GitHub. https://github.com/aizexss/unidirectional/tree/article1-submission-20261030-r2</w:t>
       </w:r>
     </w:p>
     <w:sectPr>

</xml_diff>

<commit_message>
docs: strengthen provenance contribution and journal presentation
</commit_message>
<xml_diff>
--- a/manuscript/Ibragimov_Aibar_Article_Revised.docx
+++ b/manuscript/Ibragimov_Aibar_Article_Revised.docx
@@ -254,6 +254,19 @@
     </w:p>
     <w:p>
       <w:pPr>
+        <w:pStyle w:val="2"/>
+        <w:spacing w:before="140" w:after="80"/>
+      </w:pPr>
+      <w:r>
+        <w:rPr>
+          <w:szCs w:val="24"/>
+        </w:rPr>
+        <w:lastRenderedPageBreak/>
+        <w:t>Specific contribution</w:t>
+      </w:r>
+    </w:p>
+    <w:p>
+      <w:pPr>
         <w:ind w:firstLine="709"/>
         <w:jc w:val="both"/>
         <w:rPr>
@@ -265,24 +278,11 @@
           <w:szCs w:val="24"/>
           <w:lang w:val="en-US"/>
         </w:rPr>
-        <w:t>The study asks when available evidence establishes common provenance (RQ 1), how repeated values and source correlation limit detection (RQ 2), and how publication affects coherence, completeness and freshness under loss and restart (RQ 3).</w:t>
+        <w:t>The contribution is a domain-specific characterization of what a one-way receiver can establish about common source capture. It combines an explicit capture-to-read provenance contract with evidence conditions for proved coherence, proved mixing, ambiguity and contradiction.</w:t>
       </w:r>
     </w:p>
     <w:p>
       <w:pPr>
-        <w:pStyle w:val="2"/>
-        <w:spacing w:before="140" w:after="80"/>
-      </w:pPr>
-      <w:r>
-        <w:rPr>
-          <w:szCs w:val="24"/>
-        </w:rPr>
-        <w:lastRenderedPageBreak/>
-        <w:t>Specific contribution</w:t>
-      </w:r>
-    </w:p>
-    <w:p>
-      <w:pPr>
         <w:ind w:firstLine="709"/>
         <w:jc w:val="both"/>
         <w:rPr>
@@ -294,39 +294,7 @@
           <w:szCs w:val="24"/>
           <w:lang w:val="en-US"/>
         </w:rPr>
-        <w:t>The added contribution is a criterion for deciding what common source capture can be established at the receiving interface. For complete observations, it distinguishes proved coherence, proved mixing, insufficient evidence and contradiction, using only the values and provenance evidence exposed to the monitor.</w:t>
-      </w:r>
-    </w:p>
-    <w:p>
-      <w:pPr>
-        <w:ind w:firstLine="709"/>
-        <w:jc w:val="both"/>
-        <w:rPr>
-          <w:lang w:val="en-US"/>
-        </w:rPr>
-      </w:pPr>
-      <w:r>
-        <w:rPr>
-          <w:szCs w:val="24"/>
-          <w:lang w:val="en-US"/>
-        </w:rPr>
-        <w:t>For the declared repeated diagonal family, the paper derives an equality-evidence certificate and quantifies the fraction of mixing visible from values through collision and Markov-lag formulas. These results identify when repeated values prevent a conclusive decision, even if the receiver reads all fields atomically.</w:t>
-      </w:r>
-    </w:p>
-    <w:p>
-      <w:pPr>
-        <w:ind w:firstLine="709"/>
-        <w:jc w:val="both"/>
-        <w:rPr>
-          <w:lang w:val="en-US"/>
-        </w:rPr>
-      </w:pPr>
-      <w:r>
-        <w:rPr>
-          <w:szCs w:val="24"/>
-          <w:lang w:val="en-US"/>
-        </w:rPr>
-        <w:t>A paired computational study then measures hidden mixing, evidential coverage and fresh coherent availability under publication, loss and restart. Atomic snapshots, linearizability and inconclusive monitoring remain the established foundations; the contribution is the explicit provenance contract, its evidence conditions and their quantitative evaluation for one-way telemetry.</w:t>
+        <w:t>An equality-evidence certificate for the declared repeated diagonal family and a paired computational study quantify hidden mixing, conclusive coverage and fresh coherent availability. Atomic snapshots, compatible-explanation semantics and the four-valued verdict structure are established foundations; the contribution is their provenance-specific instantiation and reproducible evaluation under publication, loss and restart.</w:t>
       </w:r>
     </w:p>
     <w:p>
@@ -372,7 +340,7 @@
           <w:szCs w:val="24"/>
           <w:lang w:val="en-US"/>
         </w:rPr>
-        <w:t>Monitoring over unreliable, out-of-order streams and inconclusive verdicts are established runtime-verification topics [5,6]. Assumption-based approaches retain executions compatible with incomplete observations [7,8]. We specialize these ideas to field origins, without claiming a new general temporal logic. Repeated values can make coherent and mixed provenance indistinguishable. OPC UA serialization and PubSub provide grouping mechanisms [9,10]; access attributes and Read semantics define further server-side boundaries [11,12]. An adapter must still establish its own capture and access contract.</w:t>
+        <w:t>Temporal monitoring over unreliable, out-of-order streams is established [5,6]. Assumption-based approaches retain compatible executions; four-valued real-time and symbolic monitoring already address uncertainty [7,8]. Here these foundations are instantiated with capture-origin evidence. OPC UA serialization and PubSub provide grouping mechanisms [9,10], while access attributes and Read semantics define server-side boundaries [11,12]. The adapter must establish its capture and access contract.</w:t>
       </w:r>
     </w:p>
     <w:p>
@@ -388,7 +356,496 @@
           <w:szCs w:val="24"/>
           <w:lang w:val="en-US"/>
         </w:rPr>
-        <w:t>Age-of-information research separates data freshness from delivery [13], including industrial scheduling studies [14]. We measure fresh coherent availability rather than optimize a scheduler. Our burst process is a declared two-state Markov model, not a fitted device channel. Separate random streams and documented generator behavior support controlled comparisons [15,16]. Bootstrap design and simulation-reporting guidance motivate whole-run intervals and explicit model disclosure [17,18]. Repeating computations is distinct from validating a physical installation [19].</w:t>
+        <w:t>Age-of-information research separates freshness from delivery [13], including industrial scheduling [14]. We measure fresh coherent availability. Separate random streams and documented generator behavior support comparisons [15,16]; bootstrap and simulation-reporting guidance motivate whole-run intervals and model disclosure [17,18]. Reproduction does not validate a physical installation [19]. Table 1 distinguishes established guarantees from this study’s scope.</w:t>
+      </w:r>
+    </w:p>
+    <w:p>
+      <w:pPr>
+        <w:keepNext/>
+        <w:keepLines/>
+        <w:spacing w:before="60" w:after="120"/>
+        <w:rPr>
+          <w:lang w:val="en-US"/>
+        </w:rPr>
+      </w:pPr>
+      <w:r>
+        <w:t>Table 1. Established verification guarantees and the scope of this study.</w:t>
+      </w:r>
+    </w:p>
+    <w:tbl>
+      <w:tblPr>
+        <w:tblW w:w="9355" w:type="dxa"/>
+        <w:jc w:val="center"/>
+        <w:tblBorders>
+          <w:top w:val="single" w:sz="4" w:space="0" w:color="D9D9D9"/>
+          <w:left w:val="single" w:sz="4" w:space="0" w:color="D9D9D9"/>
+          <w:bottom w:val="single" w:sz="4" w:space="0" w:color="D9D9D9"/>
+          <w:right w:val="single" w:sz="4" w:space="0" w:color="D9D9D9"/>
+          <w:insideH w:val="single" w:sz="4" w:space="0" w:color="D9D9D9"/>
+          <w:insideV w:val="single" w:sz="4" w:space="0" w:color="D9D9D9"/>
+        </w:tblBorders>
+        <w:tblLayout w:type="fixed"/>
+        <w:tblCellMar>
+          <w:top w:w="70" w:type="dxa"/>
+          <w:left w:w="85" w:type="dxa"/>
+          <w:bottom w:w="70" w:type="dxa"/>
+          <w:right w:w="85" w:type="dxa"/>
+        </w:tblCellMar>
+        <w:tblLook w:val="04A0" w:firstRow="1" w:lastRow="0" w:firstColumn="1" w:lastColumn="0" w:noHBand="0" w:noVBand="1"/>
+      </w:tblPr>
+      <w:tblGrid>
+        <w:gridCol w:w="2400"/>
+        <w:gridCol w:w="3300"/>
+        <w:gridCol w:w="3650"/>
+      </w:tblGrid>
+      <w:tr>
+        <w:trPr>
+          <w:cantSplit/>
+          <w:tblHeader/>
+          <w:jc w:val="center"/>
+        </w:trPr>
+        <w:tc>
+          <w:tcPr>
+            <w:tcW w:w="2400" w:type="dxa"/>
+            <w:shd w:val="clear" w:color="auto" w:fill="E7ECEF"/>
+            <w:tcMar>
+              <w:top w:w="55" w:type="dxa"/>
+              <w:left w:w="65" w:type="dxa"/>
+              <w:bottom w:w="55" w:type="dxa"/>
+              <w:right w:w="65" w:type="dxa"/>
+            </w:tcMar>
+            <w:vAlign w:val="center"/>
+          </w:tcPr>
+          <w:p>
+            <w:pPr>
+              <w:keepNext/>
+              <w:keepLines/>
+            </w:pPr>
+            <w:r>
+              <w:rPr>
+                <w:rFonts w:eastAsia="Times New Roman"/>
+                <w:b/>
+                <w:szCs w:val="24"/>
+              </w:rPr>
+              <w:t>Existing approach</w:t>
+            </w:r>
+          </w:p>
+        </w:tc>
+        <w:tc>
+          <w:tcPr>
+            <w:tcW w:w="3300" w:type="dxa"/>
+            <w:shd w:val="clear" w:color="auto" w:fill="E7ECEF"/>
+            <w:tcMar>
+              <w:top w:w="55" w:type="dxa"/>
+              <w:left w:w="65" w:type="dxa"/>
+              <w:bottom w:w="55" w:type="dxa"/>
+              <w:right w:w="65" w:type="dxa"/>
+            </w:tcMar>
+            <w:vAlign w:val="center"/>
+          </w:tcPr>
+          <w:p>
+            <w:pPr>
+              <w:keepNext/>
+              <w:keepLines/>
+            </w:pPr>
+            <w:r>
+              <w:rPr>
+                <w:rFonts w:eastAsia="Times New Roman"/>
+                <w:b/>
+                <w:szCs w:val="24"/>
+              </w:rPr>
+              <w:t>Established guarantee</w:t>
+            </w:r>
+          </w:p>
+        </w:tc>
+        <w:tc>
+          <w:tcPr>
+            <w:tcW w:w="3650" w:type="dxa"/>
+            <w:shd w:val="clear" w:color="auto" w:fill="E7ECEF"/>
+            <w:tcMar>
+              <w:top w:w="55" w:type="dxa"/>
+              <w:left w:w="65" w:type="dxa"/>
+              <w:bottom w:w="55" w:type="dxa"/>
+              <w:right w:w="65" w:type="dxa"/>
+            </w:tcMar>
+            <w:vAlign w:val="center"/>
+          </w:tcPr>
+          <w:p>
+            <w:pPr>
+              <w:keepNext/>
+              <w:keepLines/>
+            </w:pPr>
+            <w:r>
+              <w:rPr>
+                <w:rFonts w:eastAsia="Times New Roman"/>
+                <w:b/>
+                <w:szCs w:val="24"/>
+              </w:rPr>
+              <w:t>Focus of this study</w:t>
+            </w:r>
+          </w:p>
+        </w:tc>
+      </w:tr>
+      <w:tr>
+        <w:trPr>
+          <w:cantSplit/>
+          <w:jc w:val="center"/>
+        </w:trPr>
+        <w:tc>
+          <w:tcPr>
+            <w:tcW w:w="2400" w:type="dxa"/>
+            <w:shd w:val="clear" w:color="auto" w:fill="FFFFFF"/>
+            <w:tcMar>
+              <w:top w:w="55" w:type="dxa"/>
+              <w:left w:w="65" w:type="dxa"/>
+              <w:bottom w:w="55" w:type="dxa"/>
+              <w:right w:w="65" w:type="dxa"/>
+            </w:tcMar>
+            <w:vAlign w:val="center"/>
+          </w:tcPr>
+          <w:p>
+            <w:pPr>
+              <w:keepLines/>
+            </w:pPr>
+            <w:r>
+              <w:rPr>
+                <w:rFonts w:eastAsia="Times New Roman"/>
+                <w:szCs w:val="24"/>
+              </w:rPr>
+              <w:t>Atomic snapshots and linearizability [3]</w:t>
+            </w:r>
+          </w:p>
+        </w:tc>
+        <w:tc>
+          <w:tcPr>
+            <w:tcW w:w="3300" w:type="dxa"/>
+            <w:shd w:val="clear" w:color="auto" w:fill="FFFFFF"/>
+            <w:tcMar>
+              <w:top w:w="55" w:type="dxa"/>
+              <w:left w:w="65" w:type="dxa"/>
+              <w:bottom w:w="55" w:type="dxa"/>
+              <w:right w:w="65" w:type="dxa"/>
+            </w:tcMar>
+            <w:vAlign w:val="center"/>
+          </w:tcPr>
+          <w:p>
+            <w:pPr>
+              <w:keepLines/>
+            </w:pPr>
+            <w:r>
+              <w:rPr>
+                <w:rFonts w:eastAsia="Times New Roman"/>
+                <w:szCs w:val="24"/>
+              </w:rPr>
+              <w:t>A legal instantaneous state of the specified concurrent object.</w:t>
+            </w:r>
+          </w:p>
+        </w:tc>
+        <w:tc>
+          <w:tcPr>
+            <w:tcW w:w="3650" w:type="dxa"/>
+            <w:shd w:val="clear" w:color="auto" w:fill="FFFFFF"/>
+            <w:tcMar>
+              <w:top w:w="55" w:type="dxa"/>
+              <w:left w:w="65" w:type="dxa"/>
+              <w:bottom w:w="55" w:type="dxa"/>
+              <w:right w:w="65" w:type="dxa"/>
+            </w:tcMar>
+            <w:vAlign w:val="center"/>
+          </w:tcPr>
+          <w:p>
+            <w:pPr>
+              <w:keepLines/>
+              <w:rPr>
+                <w:lang w:val="en-US"/>
+              </w:rPr>
+            </w:pPr>
+            <w:r>
+              <w:rPr>
+                <w:rFonts w:eastAsia="Times New Roman"/>
+                <w:szCs w:val="24"/>
+                <w:lang w:val="en-US"/>
+              </w:rPr>
+              <w:t>Separates atomic receiver access from the capture origins of asynchronously published fields.</w:t>
+            </w:r>
+          </w:p>
+        </w:tc>
+      </w:tr>
+      <w:tr>
+        <w:trPr>
+          <w:cantSplit/>
+          <w:jc w:val="center"/>
+        </w:trPr>
+        <w:tc>
+          <w:tcPr>
+            <w:tcW w:w="2400" w:type="dxa"/>
+            <w:shd w:val="clear" w:color="auto" w:fill="FFFFFF"/>
+            <w:tcMar>
+              <w:top w:w="55" w:type="dxa"/>
+              <w:left w:w="65" w:type="dxa"/>
+              <w:bottom w:w="55" w:type="dxa"/>
+              <w:right w:w="65" w:type="dxa"/>
+            </w:tcMar>
+            <w:vAlign w:val="center"/>
+          </w:tcPr>
+          <w:p>
+            <w:pPr>
+              <w:keepLines/>
+            </w:pPr>
+            <w:r>
+              <w:rPr>
+                <w:rFonts w:eastAsia="Times New Roman"/>
+                <w:szCs w:val="24"/>
+              </w:rPr>
+              <w:t>Out-of-order stream monitoring [5]</w:t>
+            </w:r>
+          </w:p>
+        </w:tc>
+        <w:tc>
+          <w:tcPr>
+            <w:tcW w:w="3300" w:type="dxa"/>
+            <w:shd w:val="clear" w:color="auto" w:fill="FFFFFF"/>
+            <w:tcMar>
+              <w:top w:w="55" w:type="dxa"/>
+              <w:left w:w="65" w:type="dxa"/>
+              <w:bottom w:w="55" w:type="dxa"/>
+              <w:right w:w="65" w:type="dxa"/>
+            </w:tcMar>
+            <w:vAlign w:val="center"/>
+          </w:tcPr>
+          <w:p>
+            <w:pPr>
+              <w:keepLines/>
+            </w:pPr>
+            <w:r>
+              <w:rPr>
+                <w:rFonts w:eastAsia="Times New Roman"/>
+                <w:szCs w:val="24"/>
+              </w:rPr>
+              <w:t>Sound temporal verdicts despite delayed, reordered or missing events.</w:t>
+            </w:r>
+          </w:p>
+        </w:tc>
+        <w:tc>
+          <w:tcPr>
+            <w:tcW w:w="3650" w:type="dxa"/>
+            <w:shd w:val="clear" w:color="auto" w:fill="FFFFFF"/>
+            <w:tcMar>
+              <w:top w:w="55" w:type="dxa"/>
+              <w:left w:w="65" w:type="dxa"/>
+              <w:bottom w:w="55" w:type="dxa"/>
+              <w:right w:w="65" w:type="dxa"/>
+            </w:tcMar>
+            <w:vAlign w:val="center"/>
+          </w:tcPr>
+          <w:p>
+            <w:pPr>
+              <w:keepLines/>
+              <w:rPr>
+                <w:lang w:val="en-US"/>
+              </w:rPr>
+            </w:pPr>
+            <w:r>
+              <w:rPr>
+                <w:rFonts w:eastAsia="Times New Roman"/>
+                <w:szCs w:val="24"/>
+                <w:lang w:val="en-US"/>
+              </w:rPr>
+              <w:t>Tests common origin at each complete read and measures mixing hidden by repeated values.</w:t>
+            </w:r>
+          </w:p>
+        </w:tc>
+      </w:tr>
+      <w:tr>
+        <w:trPr>
+          <w:cantSplit/>
+          <w:jc w:val="center"/>
+        </w:trPr>
+        <w:tc>
+          <w:tcPr>
+            <w:tcW w:w="2400" w:type="dxa"/>
+            <w:shd w:val="clear" w:color="auto" w:fill="FFFFFF"/>
+            <w:tcMar>
+              <w:top w:w="55" w:type="dxa"/>
+              <w:left w:w="65" w:type="dxa"/>
+              <w:bottom w:w="55" w:type="dxa"/>
+              <w:right w:w="65" w:type="dxa"/>
+            </w:tcMar>
+            <w:vAlign w:val="center"/>
+          </w:tcPr>
+          <w:p>
+            <w:pPr>
+              <w:keepLines/>
+            </w:pPr>
+            <w:r>
+              <w:rPr>
+                <w:rFonts w:eastAsia="Times New Roman"/>
+                <w:szCs w:val="24"/>
+              </w:rPr>
+              <w:t>Assumption-based real-time monitoring [7]</w:t>
+            </w:r>
+          </w:p>
+        </w:tc>
+        <w:tc>
+          <w:tcPr>
+            <w:tcW w:w="3300" w:type="dxa"/>
+            <w:shd w:val="clear" w:color="auto" w:fill="FFFFFF"/>
+            <w:tcMar>
+              <w:top w:w="55" w:type="dxa"/>
+              <w:left w:w="65" w:type="dxa"/>
+              <w:bottom w:w="55" w:type="dxa"/>
+              <w:right w:w="65" w:type="dxa"/>
+            </w:tcMar>
+            <w:vAlign w:val="center"/>
+          </w:tcPr>
+          <w:p>
+            <w:pPr>
+              <w:keepLines/>
+            </w:pPr>
+            <w:r>
+              <w:rPr>
+                <w:rFonts w:eastAsia="Times New Roman"/>
+                <w:szCs w:val="24"/>
+              </w:rPr>
+              <w:t>Four verdicts over executions compatible with uncertain observations and assumptions.</w:t>
+            </w:r>
+          </w:p>
+        </w:tc>
+        <w:tc>
+          <w:tcPr>
+            <w:tcW w:w="3650" w:type="dxa"/>
+            <w:shd w:val="clear" w:color="auto" w:fill="FFFFFF"/>
+            <w:tcMar>
+              <w:top w:w="55" w:type="dxa"/>
+              <w:left w:w="65" w:type="dxa"/>
+              <w:bottom w:w="55" w:type="dxa"/>
+              <w:right w:w="65" w:type="dxa"/>
+            </w:tcMar>
+            <w:vAlign w:val="center"/>
+          </w:tcPr>
+          <w:p>
+            <w:pPr>
+              <w:keepLines/>
+              <w:rPr>
+                <w:lang w:val="en-US"/>
+              </w:rPr>
+            </w:pPr>
+            <w:r>
+              <w:rPr>
+                <w:rFonts w:eastAsia="Times New Roman"/>
+                <w:szCs w:val="24"/>
+                <w:lang w:val="en-US"/>
+              </w:rPr>
+              <w:t>Instantiates these verdicts with capture-origin evidence and explicit binding obligations.</w:t>
+            </w:r>
+          </w:p>
+        </w:tc>
+      </w:tr>
+      <w:tr>
+        <w:trPr>
+          <w:cantSplit/>
+          <w:jc w:val="center"/>
+        </w:trPr>
+        <w:tc>
+          <w:tcPr>
+            <w:tcW w:w="2400" w:type="dxa"/>
+            <w:shd w:val="clear" w:color="auto" w:fill="FFFFFF"/>
+            <w:tcMar>
+              <w:top w:w="55" w:type="dxa"/>
+              <w:left w:w="65" w:type="dxa"/>
+              <w:bottom w:w="55" w:type="dxa"/>
+              <w:right w:w="65" w:type="dxa"/>
+            </w:tcMar>
+            <w:vAlign w:val="center"/>
+          </w:tcPr>
+          <w:p>
+            <w:pPr>
+              <w:keepLines/>
+            </w:pPr>
+            <w:r>
+              <w:rPr>
+                <w:rFonts w:eastAsia="Times New Roman"/>
+                <w:szCs w:val="24"/>
+              </w:rPr>
+              <w:t>Symbolic stream monitoring [8]</w:t>
+            </w:r>
+          </w:p>
+        </w:tc>
+        <w:tc>
+          <w:tcPr>
+            <w:tcW w:w="3300" w:type="dxa"/>
+            <w:shd w:val="clear" w:color="auto" w:fill="FFFFFF"/>
+            <w:tcMar>
+              <w:top w:w="55" w:type="dxa"/>
+              <w:left w:w="65" w:type="dxa"/>
+              <w:bottom w:w="55" w:type="dxa"/>
+              <w:right w:w="65" w:type="dxa"/>
+            </w:tcMar>
+            <w:vAlign w:val="center"/>
+          </w:tcPr>
+          <w:p>
+            <w:pPr>
+              <w:keepLines/>
+            </w:pPr>
+            <w:r>
+              <w:rPr>
+                <w:rFonts w:eastAsia="Times New Roman"/>
+                <w:szCs w:val="24"/>
+              </w:rPr>
+              <w:t>Constraints exploit imprecise inputs and assumptions; specified fragments use constant memory.</w:t>
+            </w:r>
+          </w:p>
+        </w:tc>
+        <w:tc>
+          <w:tcPr>
+            <w:tcW w:w="3650" w:type="dxa"/>
+            <w:shd w:val="clear" w:color="auto" w:fill="FFFFFF"/>
+            <w:tcMar>
+              <w:top w:w="55" w:type="dxa"/>
+              <w:left w:w="65" w:type="dxa"/>
+              <w:bottom w:w="55" w:type="dxa"/>
+              <w:right w:w="65" w:type="dxa"/>
+            </w:tcMar>
+            <w:vAlign w:val="center"/>
+          </w:tcPr>
+          <w:p>
+            <w:pPr>
+              <w:keepLines/>
+              <w:rPr>
+                <w:lang w:val="en-US"/>
+              </w:rPr>
+            </w:pPr>
+            <w:r>
+              <w:rPr>
+                <w:rFonts w:eastAsia="Times New Roman"/>
+                <w:szCs w:val="24"/>
+                <w:lang w:val="en-US"/>
+              </w:rPr>
+              <w:t>Quantifies provenance ambiguity, detection coverage and fresh coherent availability for two publication modes.</w:t>
+            </w:r>
+          </w:p>
+        </w:tc>
+      </w:tr>
+    </w:tbl>
+    <w:p>
+      <w:pPr>
+        <w:pStyle w:val="2"/>
+        <w:spacing w:before="140" w:after="80"/>
+      </w:pPr>
+      <w:r>
+        <w:t>The aim and objectives of the study</w:t>
+      </w:r>
+    </w:p>
+    <w:p>
+      <w:pPr>
+        <w:ind w:firstLine="709"/>
+        <w:jc w:val="both"/>
+        <w:rPr>
+          <w:lang w:val="en-US"/>
+        </w:rPr>
+      </w:pPr>
+      <w:r>
+        <w:t>The aim is to establish when a receiver can justify common capture provenance and receive a fresh coherent state. The objectives are to formalize evidence-based verdicts (RQ 1), quantify detection limits from repeated values and source correlation (RQ 2), and compare coherence, completeness and freshness under loss and receiver restart (RQ 3).</w:t>
       </w:r>
     </w:p>
     <w:p>
@@ -402,7 +859,7 @@
           <w:rFonts w:eastAsia="Times New Roman"/>
           <w:szCs w:val="24"/>
         </w:rPr>
-        <w:t>Provenance model and monitoring method</w:t>
+        <w:t>Materials and methods</w:t>
       </w:r>
     </w:p>
     <w:p>
@@ -608,7 +1065,7 @@
         <w:rPr>
           <w:szCs w:val="24"/>
         </w:rPr>
-        <w:t>Figure 1 identifies these boundaries.</w:t>
+        <w:t>Fig. 1 identifies these boundaries.</w:t>
       </w:r>
     </w:p>
     <w:p>
@@ -909,7 +1366,7 @@
           <w:szCs w:val="24"/>
           <w:lang w:val="en-US"/>
         </w:rPr>
-        <w:t xml:space="preserve"> contains a coherent and a mixed witness, respectively. Their existence determines the verdict (Table 1). An offline or incomplete read is unavailable before this test; this acquisition status is separate from coherence.</w:t>
+        <w:t xml:space="preserve"> contains a coherent and a mixed witness, respectively. Their existence determines the verdict (Table 2). An offline or incomplete read is unavailable before this test; this acquisition status is separate from coherence.</w:t>
       </w:r>
     </w:p>
     <w:p>
@@ -926,7 +1383,7 @@
           <w:szCs w:val="24"/>
           <w:lang w:val="en-US"/>
         </w:rPr>
-        <w:t>Table 1. Verdicts for a complete observation</w:t>
+        <w:t>Table 2. Verdicts for a complete observation</w:t>
       </w:r>
     </w:p>
     <w:tbl>
@@ -1655,7 +2112,7 @@
           <w:lang w:val="en-US"/>
         </w:rPr>
         <w:lastRenderedPageBreak/>
-        <w:t>equality links. This assumes unrestricted origin identities and is not a bound on metadata bytes or authentication cost (Table 2).</w:t>
+        <w:t>equality links. This assumes unrestricted origin identities and is not a bound on metadata bytes or authentication cost (Table 3).</w:t>
       </w:r>
     </w:p>
     <w:p>
@@ -1672,7 +2129,7 @@
           <w:szCs w:val="24"/>
           <w:lang w:val="en-US"/>
         </w:rPr>
-        <w:t>Table 2. Counterexamples that delimit the guarantee</w:t>
+        <w:t>Table 3. Counterexamples that delimit the guarantee</w:t>
       </w:r>
     </w:p>
     <w:tbl>
@@ -2506,7 +2963,7 @@
           <w:szCs w:val="24"/>
           <w:lang w:val="en-US"/>
         </w:rPr>
-        <w:t>Two independent fair binary origins give 50% detectable mixing; three give 75% (Figure 2). These collision probabilities condition on actual mixing. Conclusive coverage over all reads additionally depends on mixing prevalence and completeness.</w:t>
+        <w:t>Two independent fair binary origins give 50% detectable mixing; three give 75% (Fig. 2). These collision probabilities condition on actual mixing. Conclusive coverage over all reads additionally depends on mixing prevalence and completeness.</w:t>
       </w:r>
     </w:p>
     <w:p>
@@ -2811,7 +3268,7 @@
           <w:szCs w:val="24"/>
           <w:lang w:val="en-US"/>
         </w:rPr>
-        <w:t>=0.50 (Table 3). Forty independent replicate indices per condition yield 480 condition-specific pairs and 960 mode runs. Common random inputs couple conditions, so the 480 pairs are not mutually independent. Table 3 and the artifact configuration record the declared factors and analysis settings.</w:t>
+        <w:t>=0.50 (Table 4). Forty independent replicate indices per condition yield 480 condition-specific pairs and 960 mode runs. Common random inputs couple conditions, so the 480 pairs are not mutually independent. Table 4 and the artifact configuration record the declared factors and analysis settings.</w:t>
       </w:r>
     </w:p>
     <w:p>
@@ -2827,7 +3284,7 @@
         <w:rPr>
           <w:szCs w:val="24"/>
         </w:rPr>
-        <w:t>Table 3. Declared synthetic simulation conditions</w:t>
+        <w:t>Table 4. Declared synthetic simulation conditions</w:t>
       </w:r>
     </w:p>
     <w:tbl>
@@ -4692,7 +5149,7 @@
           <w:szCs w:val="24"/>
           <w:lang w:val="en-US"/>
         </w:rPr>
-        <w:t>At m=3 and q=2, eight histories produce 128 R0 and 32 R1 configurations (Table 4). R0 has 24 coherent, 48 mixed and 56 incomplete configurations. V detects 24 mixed cases and leaves 48 complete cases ambiguous, including 24 mixed ones. I resolves all 72 complete cases. For R1, V leaves all 24 coherent complete cases ambiguous; truthful I or G resolves them.</w:t>
+        <w:t>At m=3 and q=2, eight histories produce 128 R0 and 32 R1 configurations (Table 5). R0 has 24 coherent, 48 mixed and 56 incomplete configurations. V detects 24 mixed cases and leaves 48 complete cases ambiguous, including 24 mixed ones. I resolves all 72 complete cases. For R1, V leaves all 24 coherent complete cases ambiguous; truthful I or G resolves them.</w:t>
       </w:r>
     </w:p>
     <w:p>
@@ -4709,7 +5166,7 @@
           <w:szCs w:val="24"/>
           <w:lang w:val="en-US"/>
         </w:rPr>
-        <w:t>Table 4. Exact verdict counts for three binary generations</w:t>
+        <w:t>Table 5. Exact verdict counts for three binary generations</w:t>
       </w:r>
     </w:p>
     <w:tbl>
@@ -5825,7 +6282,7 @@
           <w:szCs w:val="24"/>
           <w:lang w:val="en-US"/>
         </w:rPr>
-        <w:t>Independent checks cover 57,520 configurations across 16 (m,q) settings, 16 collision identities, 65 exact-rational Markov recurrences and 66,064 binary evidence cases. Graph validation examines 1,098 equality graphs and 54,252 graph-partition combinations (Table 5). These are structural checks, not stochastic replications.</w:t>
+        <w:t>Independent checks cover 57,520 configurations across 16 (m,q) settings, 16 collision identities, 65 exact-rational Markov recurrences and 66,064 binary evidence cases. Graph validation examines 1,098 equality graphs and 54,252 graph-partition combinations (Table 6). These are structural checks, not stochastic replications.</w:t>
       </w:r>
     </w:p>
     <w:p>
@@ -5842,7 +6299,7 @@
           <w:szCs w:val="24"/>
           <w:lang w:val="en-US"/>
         </w:rPr>
-        <w:t>Table 5. Equality-evidence graph checks for equal-valued fields</w:t>
+        <w:t>Table 6. Equality-evidence graph checks for equal-valued fields</w:t>
       </w:r>
     </w:p>
     <w:tbl>
@@ -5893,9 +6350,9 @@
           </w:tcPr>
           <w:p>
             <w:pPr>
+              <w:keepLines/>
+              <w:jc w:val="center"/>
               <w:keepNext/>
-              <w:keepLines/>
-              <w:jc w:val="center"/>
             </w:pPr>
             <w:r>
               <w:rPr>
@@ -5921,9 +6378,9 @@
           </w:tcPr>
           <w:p>
             <w:pPr>
+              <w:keepLines/>
+              <w:jc w:val="center"/>
               <w:keepNext/>
-              <w:keepLines/>
-              <w:jc w:val="center"/>
             </w:pPr>
             <w:r>
               <w:rPr>
@@ -5949,9 +6406,9 @@
           </w:tcPr>
           <w:p>
             <w:pPr>
+              <w:keepLines/>
+              <w:jc w:val="center"/>
               <w:keepNext/>
-              <w:keepLines/>
-              <w:jc w:val="center"/>
             </w:pPr>
             <w:r>
               <w:rPr>
@@ -5977,9 +6434,9 @@
           </w:tcPr>
           <w:p>
             <w:pPr>
+              <w:keepLines/>
+              <w:jc w:val="center"/>
               <w:keepNext/>
-              <w:keepLines/>
-              <w:jc w:val="center"/>
             </w:pPr>
             <w:r>
               <w:rPr>
@@ -6005,9 +6462,9 @@
           </w:tcPr>
           <w:p>
             <w:pPr>
+              <w:keepLines/>
+              <w:jc w:val="center"/>
               <w:keepNext/>
-              <w:keepLines/>
-              <w:jc w:val="center"/>
             </w:pPr>
             <w:r>
               <w:rPr>
@@ -6041,6 +6498,7 @@
             <w:pPr>
               <w:keepLines/>
               <w:jc w:val="center"/>
+              <w:keepNext/>
             </w:pPr>
             <w:r>
               <w:rPr>
@@ -6067,6 +6525,7 @@
             <w:pPr>
               <w:keepLines/>
               <w:jc w:val="center"/>
+              <w:keepNext/>
             </w:pPr>
             <w:r>
               <w:rPr>
@@ -6093,6 +6552,7 @@
             <w:pPr>
               <w:keepLines/>
               <w:jc w:val="center"/>
+              <w:keepNext/>
             </w:pPr>
             <w:r>
               <w:rPr>
@@ -6119,6 +6579,7 @@
             <w:pPr>
               <w:keepLines/>
               <w:jc w:val="center"/>
+              <w:keepNext/>
             </w:pPr>
             <w:r>
               <w:rPr>
@@ -6145,6 +6606,7 @@
             <w:pPr>
               <w:keepLines/>
               <w:jc w:val="center"/>
+              <w:keepNext/>
             </w:pPr>
             <w:r>
               <w:rPr>
@@ -6177,6 +6639,7 @@
             <w:pPr>
               <w:keepLines/>
               <w:jc w:val="center"/>
+              <w:keepNext/>
             </w:pPr>
             <w:r>
               <w:rPr>
@@ -6203,6 +6666,7 @@
             <w:pPr>
               <w:keepLines/>
               <w:jc w:val="center"/>
+              <w:keepNext/>
             </w:pPr>
             <w:r>
               <w:rPr>
@@ -6229,6 +6693,7 @@
             <w:pPr>
               <w:keepLines/>
               <w:jc w:val="center"/>
+              <w:keepNext/>
             </w:pPr>
             <w:r>
               <w:rPr>
@@ -6255,6 +6720,7 @@
             <w:pPr>
               <w:keepLines/>
               <w:jc w:val="center"/>
+              <w:keepNext/>
             </w:pPr>
             <w:r>
               <w:rPr>
@@ -6281,6 +6747,7 @@
             <w:pPr>
               <w:keepLines/>
               <w:jc w:val="center"/>
+              <w:keepNext/>
             </w:pPr>
             <w:r>
               <w:rPr>
@@ -6313,6 +6780,7 @@
             <w:pPr>
               <w:keepLines/>
               <w:jc w:val="center"/>
+              <w:keepNext/>
             </w:pPr>
             <w:r>
               <w:rPr>
@@ -6339,6 +6807,7 @@
             <w:pPr>
               <w:keepLines/>
               <w:jc w:val="center"/>
+              <w:keepNext/>
             </w:pPr>
             <w:r>
               <w:rPr>
@@ -6365,6 +6834,7 @@
             <w:pPr>
               <w:keepLines/>
               <w:jc w:val="center"/>
+              <w:keepNext/>
             </w:pPr>
             <w:r>
               <w:rPr>
@@ -6391,6 +6861,7 @@
             <w:pPr>
               <w:keepLines/>
               <w:jc w:val="center"/>
+              <w:keepNext/>
             </w:pPr>
             <w:r>
               <w:rPr>
@@ -6417,6 +6888,7 @@
             <w:pPr>
               <w:keepLines/>
               <w:jc w:val="center"/>
+              <w:keepNext/>
             </w:pPr>
             <w:r>
               <w:rPr>
@@ -6620,7 +7092,7 @@
           <w:szCs w:val="24"/>
           <w:lang w:val="en-US"/>
         </w:rPr>
-        <w:t>=0.50, R0 mixing occupies 60.89% of reads without loss, 62.14% under independent loss (95% CI 61.86–62.43%) and 58.51% under bursts (Table 6). R1 has no mixed reads. The paired independent-loss contrast is 62.14 percentage points (95% CI 61.85–62.41). This measures the specified publication combination.</w:t>
+        <w:t>=0.50, R0 mixing occupies 60.89% of reads without loss, 62.14% under independent loss (95% CI 61.86–62.43%) and 58.51% under bursts (Table 7). R1 has no mixed reads. The paired independent-loss contrast is 62.14 percentage points (95% CI 61.85–62.41). This measures the specified publication combination.</w:t>
       </w:r>
     </w:p>
     <w:p>
@@ -6637,7 +7109,7 @@
           <w:szCs w:val="24"/>
           <w:lang w:val="en-US"/>
         </w:rPr>
-        <w:t>Table 6. Time-indexed publication outcomes for selected conditions</w:t>
+        <w:t>Table 7. Time-indexed publication outcomes for selected conditions</w:t>
       </w:r>
     </w:p>
     <w:tbl>
@@ -8531,7 +9003,7 @@
           <w:szCs w:val="24"/>
           <w:lang w:val="en-US"/>
         </w:rPr>
-        <w:t xml:space="preserve"> rises (Table 7); visible mixing increases while total mixing remains 62.14%.</w:t>
+        <w:t xml:space="preserve"> rises (Table 8); visible mixing increases while total mixing remains 62.14%.</w:t>
       </w:r>
     </w:p>
     <w:p>
@@ -8548,7 +9020,7 @@
           <w:szCs w:val="24"/>
           <w:lang w:val="en-US"/>
         </w:rPr>
-        <w:t>Table 7. Effect of source repetition on R0 observability under independent loss</w:t>
+        <w:t>Table 8. Effect of source repetition on R0 observability under independent loss</w:t>
       </w:r>
     </w:p>
     <w:tbl>
@@ -8600,9 +9072,9 @@
           </w:tcPr>
           <w:p>
             <w:pPr>
+              <w:keepLines/>
+              <w:jc w:val="center"/>
               <w:keepNext/>
-              <w:keepLines/>
-              <w:jc w:val="center"/>
             </w:pPr>
             <w:r>
               <w:rPr>
@@ -8628,9 +9100,9 @@
           </w:tcPr>
           <w:p>
             <w:pPr>
+              <w:keepLines/>
+              <w:jc w:val="center"/>
               <w:keepNext/>
-              <w:keepLines/>
-              <w:jc w:val="center"/>
             </w:pPr>
             <w:r>
               <w:rPr>
@@ -8656,9 +9128,9 @@
           </w:tcPr>
           <w:p>
             <w:pPr>
+              <w:keepLines/>
+              <w:jc w:val="center"/>
               <w:keepNext/>
-              <w:keepLines/>
-              <w:jc w:val="center"/>
             </w:pPr>
             <w:r>
               <w:rPr>
@@ -8684,9 +9156,9 @@
           </w:tcPr>
           <w:p>
             <w:pPr>
+              <w:keepLines/>
+              <w:jc w:val="center"/>
               <w:keepNext/>
-              <w:keepLines/>
-              <w:jc w:val="center"/>
             </w:pPr>
             <w:r>
               <w:rPr>
@@ -8712,9 +9184,9 @@
           </w:tcPr>
           <w:p>
             <w:pPr>
+              <w:keepLines/>
+              <w:jc w:val="center"/>
               <w:keepNext/>
-              <w:keepLines/>
-              <w:jc w:val="center"/>
             </w:pPr>
             <w:r>
               <w:rPr>
@@ -8740,9 +9212,9 @@
           </w:tcPr>
           <w:p>
             <w:pPr>
+              <w:keepLines/>
+              <w:jc w:val="center"/>
               <w:keepNext/>
-              <w:keepLines/>
-              <w:jc w:val="center"/>
             </w:pPr>
             <w:r>
               <w:rPr>
@@ -8776,6 +9248,7 @@
             <w:pPr>
               <w:keepLines/>
               <w:jc w:val="center"/>
+              <w:keepNext/>
             </w:pPr>
             <w:r>
               <w:rPr>
@@ -8802,6 +9275,7 @@
             <w:pPr>
               <w:keepLines/>
               <w:jc w:val="center"/>
+              <w:keepNext/>
             </w:pPr>
             <w:r>
               <w:rPr>
@@ -8828,6 +9302,7 @@
             <w:pPr>
               <w:keepLines/>
               <w:jc w:val="center"/>
+              <w:keepNext/>
             </w:pPr>
             <w:r>
               <w:rPr>
@@ -8854,6 +9329,7 @@
             <w:pPr>
               <w:keepLines/>
               <w:jc w:val="center"/>
+              <w:keepNext/>
             </w:pPr>
             <w:r>
               <w:rPr>
@@ -8880,6 +9356,7 @@
             <w:pPr>
               <w:keepLines/>
               <w:jc w:val="center"/>
+              <w:keepNext/>
             </w:pPr>
             <w:r>
               <w:rPr>
@@ -8906,6 +9383,7 @@
             <w:pPr>
               <w:keepLines/>
               <w:jc w:val="center"/>
+              <w:keepNext/>
             </w:pPr>
             <w:r>
               <w:rPr>
@@ -8938,6 +9416,7 @@
             <w:pPr>
               <w:keepLines/>
               <w:jc w:val="center"/>
+              <w:keepNext/>
             </w:pPr>
             <w:r>
               <w:rPr>
@@ -8964,6 +9443,7 @@
             <w:pPr>
               <w:keepLines/>
               <w:jc w:val="center"/>
+              <w:keepNext/>
             </w:pPr>
             <w:r>
               <w:rPr>
@@ -8990,6 +9470,7 @@
             <w:pPr>
               <w:keepLines/>
               <w:jc w:val="center"/>
+              <w:keepNext/>
             </w:pPr>
             <w:r>
               <w:rPr>
@@ -9016,6 +9497,7 @@
             <w:pPr>
               <w:keepLines/>
               <w:jc w:val="center"/>
+              <w:keepNext/>
             </w:pPr>
             <w:r>
               <w:rPr>
@@ -9042,6 +9524,7 @@
             <w:pPr>
               <w:keepLines/>
               <w:jc w:val="center"/>
+              <w:keepNext/>
             </w:pPr>
             <w:r>
               <w:rPr>
@@ -9068,6 +9551,7 @@
             <w:pPr>
               <w:keepLines/>
               <w:jc w:val="center"/>
+              <w:keepNext/>
             </w:pPr>
             <w:r>
               <w:rPr>
@@ -9271,7 +9755,7 @@
           <w:szCs w:val="24"/>
           <w:lang w:val="en-US"/>
         </w:rPr>
-        <w:t>Figure 3 separates coherent, detected mixed and hidden mixed reads using means of 40 run-level shares.</w:t>
+        <w:t>Fig. 3 separates coherent, detected mixed and hidden mixed reads using means of 40 run-level shares.</w:t>
       </w:r>
     </w:p>
     <w:p>
@@ -9367,7 +9851,7 @@
           <w:szCs w:val="24"/>
           <w:lang w:val="en-US"/>
         </w:rPr>
-        <w:t xml:space="preserve">=0.05, 0.50 and 0.95; lag-weighted predictions are 5.935%, 50.000% and 79.180%. Residual intervals include zero. Figure 4 shows pooled lag-specific detection ratios and whole-run bootstrap intervals for C01, C04 and C07; these ratios differ from means of run-level ratios. </w:t>
+        <w:t xml:space="preserve">=0.05, 0.50 and 0.95; lag-weighted predictions are 5.935%, 50.000% and 79.180%. Residual intervals include zero. Fig. 4 shows pooled lag-specific detection ratios and whole-run bootstrap intervals for C01, C04 and C07; these ratios differ from means of run-level ratios. </w:t>
       </w:r>
       <w:r>
         <w:rPr>
@@ -9439,7 +9923,7 @@
           <w:szCs w:val="24"/>
           <w:lang w:val="en-US"/>
         </w:rPr>
-        <w:t>Fig. 4. Observed and predicted detection by generation lag.</w:t>
+        <w:t>Fig. 4. Observed and predicted detection by generation lag. Lines: Eq. (5); points and whiskers: pooled detection ratios and pointwise 95% whole-run bootstrap intervals.</w:t>
       </w:r>
     </w:p>
     <w:p>
@@ -9467,7 +9951,7 @@
           <w:szCs w:val="24"/>
           <w:lang w:val="en-US"/>
         </w:rPr>
-        <w:t>Realized channel loss averages 5.105% for R0 and 4.985% for R1 under independent loss, and 5.612% for both under shared bursts. Bursts reduce R0 mixing but prolong retained old state. R1 fresh coherent availability falls from 99.99% to 95.50% despite 100% completeness. Figure 5 reports mean run-level conditional p95 age and fresh coherent availability, with pointwise whole-run bootstrap intervals.</w:t>
+        <w:t>Realized channel loss averages 5.105% for R0 and 4.985% for R1 under independent loss, and 5.612% for both under shared bursts. Bursts reduce R0 mixing but prolong retained old state. R1 fresh coherent availability falls from 99.99% to 95.50% despite 100% completeness. Fig. 5 reports mean run-level conditional p95 age and fresh coherent availability, with pointwise whole-run bootstrap intervals.</w:t>
       </w:r>
     </w:p>
     <w:p>
@@ -9534,20 +10018,20 @@
           <w:szCs w:val="24"/>
           <w:lang w:val="en-US"/>
         </w:rPr>
-        <w:t xml:space="preserve">Fig. 5. Coherent-state age and fresh coherent availability at </w:t>
-      </w:r>
-      <w:r>
-        <w:rPr>
-          <w:szCs w:val="24"/>
-        </w:rPr>
-        <w:t>α</w:t>
-      </w:r>
-      <w:r>
-        <w:rPr>
-          <w:szCs w:val="24"/>
-          <w:lang w:val="en-US"/>
-        </w:rPr>
-        <w:t>=0.50.</w:t>
+        <w:t xml:space="preserve">Fig. 5. Coherent-state age and availability at α=0.50: a — mean run-level p95 age; b — fresh coherent reads. Whiskers show pointwise 95% whole-run bootstrap intervals.</w:t>
+      </w:r>
+      <w:r>
+        <w:rPr>
+          <w:szCs w:val="24"/>
+        </w:rPr>
+        <w:t/>
+      </w:r>
+      <w:r>
+        <w:rPr>
+          <w:szCs w:val="24"/>
+          <w:lang w:val="en-US"/>
+        </w:rPr>
+        <w:t/>
       </w:r>
     </w:p>
     <w:p>
@@ -9563,7 +10047,7 @@
           <w:szCs w:val="24"/>
           <w:lang w:val="en-US"/>
         </w:rPr>
-        <w:t>The 200 ms outage covers 40 reads. Clearing R1 in C10 gives 98.94% completeness and 98.93% fresh coherent availability; preserving it in C11 gives 99.00% and 98.93%. Figure 6 shows the C10 seed-0 trace. Age gaps represent mixed or unavailable state. A slow-source control distinguishes restart policies: on recovery, clear leaves no state while preserve exposes a coherent object aged 1,200 ms.</w:t>
+        <w:t>The 200 ms outage covers 40 reads. Clearing R1 in C10 gives 98.94% completeness and 98.93% fresh coherent availability; preserving it in C11 gives 99.00% and 98.93%. Fig. 6 shows the C10 seed-0 trace. Age gaps represent mixed or unavailable state. A slow-source control distinguishes restart policies: on recovery, clear leaves no state while preserve exposes a coherent object aged 1,200 ms.</w:t>
       </w:r>
     </w:p>
     <w:p>
@@ -9629,7 +10113,7 @@
           <w:szCs w:val="24"/>
           <w:lang w:val="en-US"/>
         </w:rPr>
-        <w:t>Fig. 6. Read status and coherent-state age around receiver restart (C10, seed 0).</w:t>
+        <w:t>Fig. 6. Receiver restart (C10, seed 0): a — scheduled-read status; b — R0 coherent-state age; c — R1 coherent-state age. Age gaps indicate mixed or unavailable state.</w:t>
       </w:r>
     </w:p>
     <w:p>
@@ -9785,7 +10269,7 @@
           <w:szCs w:val="24"/>
           <w:lang w:val="en-US"/>
         </w:rPr>
-        <w:t>, under tag article1-submission-20261030-r2 [20]. The materials include source histories, the complete reading log, metrics, models, independent validators and SHA-256 manifests (Table 8).</w:t>
+        <w:t>, under tag article1-submission-20261030-r3 [20]. The materials include source histories, the complete reading log, metrics, models, independent validators and SHA-256 manifests (Table 9).</w:t>
       </w:r>
     </w:p>
     <w:p>
@@ -9833,7 +10317,7 @@
         <w:rPr>
           <w:szCs w:val="24"/>
         </w:rPr>
-        <w:t>Table 8. Artifact dictionary and interpretation</w:t>
+        <w:t>Table 9. Artifact dictionary and interpretation</w:t>
       </w:r>
     </w:p>
     <w:tbl>
@@ -10978,28 +11462,25 @@
       </w:pPr>
       <w:r>
         <w:rPr>
-          <w:rFonts w:eastAsia="Times New Roman"/>
-          <w:szCs w:val="24"/>
-          <w:lang w:val="en-US"/>
-        </w:rPr>
-        <w:t xml:space="preserve">[8] Kallwies, H., Leucker, M., &amp; Sánchez, C. (2022). </w:t>
-      </w:r>
-      <w:r>
-        <w:rPr>
-          <w:rFonts w:eastAsia="Times New Roman"/>
+          <w:rFonts w:ascii="Times New Roman" w:hAnsi="Times New Roman"/>
+          <w:sz w:val="24"/>
+        </w:rPr>
+        <w:t xml:space="preserve">[8] Hipler, R., Kallwies, H., Leucker, M., Montali, M., Sánchez, C., &amp; Winkler, S. (2026). Symbolic runtime verification for monitoring under uncertainties and assumptions. </w:t>
+      </w:r>
+      <w:r>
+        <w:rPr>
+          <w:rFonts w:ascii="Times New Roman" w:hAnsi="Times New Roman"/>
+          <w:sz w:val="24"/>
           <w:i/>
-          <w:szCs w:val="24"/>
-          <w:lang w:val="en-US"/>
-        </w:rPr>
-        <w:t>Symbolic runtime verification for monitoring under uncertainties and assumptions</w:t>
-      </w:r>
-      <w:r>
-        <w:rPr>
-          <w:rFonts w:eastAsia="Times New Roman"/>
-          <w:szCs w:val="24"/>
-          <w:lang w:val="en-US"/>
-        </w:rPr>
-        <w:t xml:space="preserve"> [Preprint]. arXiv. https://doi.org/10.48550/arXiv.2207.05678</w:t>
+        </w:rPr>
+        <w:t xml:space="preserve">Information and Software Technology, 191</w:t>
+      </w:r>
+      <w:r>
+        <w:rPr>
+          <w:rFonts w:ascii="Times New Roman" w:hAnsi="Times New Roman"/>
+          <w:sz w:val="24"/>
+        </w:rPr>
+        <w:t xml:space="preserve">, Article 108004. https://doi.org/10.1016/j.infsof.2025.108004</w:t>
       </w:r>
     </w:p>
     <w:p>
@@ -11013,29 +11494,25 @@
       </w:pPr>
       <w:r>
         <w:rPr>
-          <w:rFonts w:eastAsia="Times New Roman"/>
-          <w:szCs w:val="24"/>
-          <w:lang w:val="en-US"/>
-        </w:rPr>
-        <w:lastRenderedPageBreak/>
-        <w:t xml:space="preserve">[9] OPC Foundation. (n.d.). </w:t>
-      </w:r>
-      <w:r>
-        <w:rPr>
-          <w:rFonts w:eastAsia="Times New Roman"/>
+          <w:rFonts w:ascii="Times New Roman" w:hAnsi="Times New Roman"/>
+          <w:sz w:val="24"/>
+        </w:rPr>
+        <w:t xml:space="preserve">[9] OPC Foundation. (2025). </w:t>
+      </w:r>
+      <w:r>
+        <w:rPr>
+          <w:rFonts w:ascii="Times New Roman" w:hAnsi="Times New Roman"/>
+          <w:sz w:val="24"/>
           <w:i/>
-          <w:szCs w:val="24"/>
-          <w:lang w:val="en-US"/>
-        </w:rPr>
-        <w:t>OPC Unified Architecture Part 25: Object Serialization</w:t>
-      </w:r>
-      <w:r>
-        <w:rPr>
-          <w:rFonts w:eastAsia="Times New Roman"/>
-          <w:szCs w:val="24"/>
-          <w:lang w:val="en-US"/>
-        </w:rPr>
-        <w:t xml:space="preserve"> (Section 4.5). Retrieved October 29, 2026, from https://reference.opcfoundation.org/specs/OPC-10000-25/4.5</w:t>
+        </w:rPr>
+        <w:t xml:space="preserve">OPC Unified Architecture Part 25: Object Serialization</w:t>
+      </w:r>
+      <w:r>
+        <w:rPr>
+          <w:rFonts w:ascii="Times New Roman" w:hAnsi="Times New Roman"/>
+          <w:sz w:val="24"/>
+        </w:rPr>
+        <w:t xml:space="preserve"> (Version 1.05.06, Section 4.5). https://reference.opcfoundation.org/specs/OPC-10000-25/4.5</w:t>
       </w:r>
     </w:p>
     <w:p>
@@ -11049,28 +11526,25 @@
       </w:pPr>
       <w:r>
         <w:rPr>
-          <w:rFonts w:eastAsia="Times New Roman"/>
-          <w:szCs w:val="24"/>
-          <w:lang w:val="en-US"/>
-        </w:rPr>
-        <w:t xml:space="preserve">[10] OPC Foundation. (n.d.). </w:t>
-      </w:r>
-      <w:r>
-        <w:rPr>
-          <w:rFonts w:eastAsia="Times New Roman"/>
+          <w:rFonts w:ascii="Times New Roman" w:hAnsi="Times New Roman"/>
+          <w:sz w:val="24"/>
+        </w:rPr>
+        <w:t xml:space="preserve">[10] OPC Foundation. (2025). </w:t>
+      </w:r>
+      <w:r>
+        <w:rPr>
+          <w:rFonts w:ascii="Times New Roman" w:hAnsi="Times New Roman"/>
+          <w:sz w:val="24"/>
           <w:i/>
-          <w:szCs w:val="24"/>
-          <w:lang w:val="en-US"/>
-        </w:rPr>
-        <w:t>OPC Unified Architecture Part 14: PubSub</w:t>
-      </w:r>
-      <w:r>
-        <w:rPr>
-          <w:rFonts w:eastAsia="Times New Roman"/>
-          <w:szCs w:val="24"/>
-          <w:lang w:val="en-US"/>
-        </w:rPr>
-        <w:t xml:space="preserve"> (Section 5.3.3). Retrieved October 29, 2026, from https://reference.opcfoundation.org/specs/OPC-10000-14/5.3.3</w:t>
+        </w:rPr>
+        <w:t xml:space="preserve">OPC Unified Architecture Part 14: PubSub</w:t>
+      </w:r>
+      <w:r>
+        <w:rPr>
+          <w:rFonts w:ascii="Times New Roman" w:hAnsi="Times New Roman"/>
+          <w:sz w:val="24"/>
+        </w:rPr>
+        <w:t xml:space="preserve"> (Version 1.05.06, Section 5.3.3). https://reference.opcfoundation.org/specs/OPC-10000-14/5.3.3</w:t>
       </w:r>
     </w:p>
     <w:p>
@@ -11084,28 +11558,25 @@
       </w:pPr>
       <w:r>
         <w:rPr>
-          <w:rFonts w:eastAsia="Times New Roman"/>
-          <w:szCs w:val="24"/>
-          <w:lang w:val="en-US"/>
-        </w:rPr>
-        <w:t xml:space="preserve">[11] OPC Foundation. (n.d.). </w:t>
-      </w:r>
-      <w:r>
-        <w:rPr>
-          <w:rFonts w:eastAsia="Times New Roman"/>
+          <w:rFonts w:ascii="Times New Roman" w:hAnsi="Times New Roman"/>
+          <w:sz w:val="24"/>
+        </w:rPr>
+        <w:t xml:space="preserve">[11] OPC Foundation. (2025). </w:t>
+      </w:r>
+      <w:r>
+        <w:rPr>
+          <w:rFonts w:ascii="Times New Roman" w:hAnsi="Times New Roman"/>
+          <w:sz w:val="24"/>
           <w:i/>
-          <w:szCs w:val="24"/>
-          <w:lang w:val="en-US"/>
-        </w:rPr>
-        <w:t>OPC Unified Architecture Part 3: Address Space Model</w:t>
-      </w:r>
-      <w:r>
-        <w:rPr>
-          <w:rFonts w:eastAsia="Times New Roman"/>
-          <w:szCs w:val="24"/>
-          <w:lang w:val="en-US"/>
-        </w:rPr>
-        <w:t xml:space="preserve"> (Section 8.58). Retrieved October 29, 2026, from https://reference.opcfoundation.org/specs/OPC-10000-3/8.58</w:t>
+        </w:rPr>
+        <w:t xml:space="preserve">OPC Unified Architecture Part 3: Address Space Model</w:t>
+      </w:r>
+      <w:r>
+        <w:rPr>
+          <w:rFonts w:ascii="Times New Roman" w:hAnsi="Times New Roman"/>
+          <w:sz w:val="24"/>
+        </w:rPr>
+        <w:t xml:space="preserve"> (Version 1.05.06, Section 8.58). https://reference.opcfoundation.org/specs/OPC-10000-3/8.58</w:t>
       </w:r>
     </w:p>
     <w:p>
@@ -11119,28 +11590,25 @@
       </w:pPr>
       <w:r>
         <w:rPr>
-          <w:rFonts w:eastAsia="Times New Roman"/>
-          <w:szCs w:val="24"/>
-          <w:lang w:val="en-US"/>
-        </w:rPr>
-        <w:t xml:space="preserve">[12] OPC Foundation. (n.d.). </w:t>
-      </w:r>
-      <w:r>
-        <w:rPr>
-          <w:rFonts w:eastAsia="Times New Roman"/>
+          <w:rFonts w:ascii="Times New Roman" w:hAnsi="Times New Roman"/>
+          <w:sz w:val="24"/>
+        </w:rPr>
+        <w:t xml:space="preserve">[12] OPC Foundation. (2026). </w:t>
+      </w:r>
+      <w:r>
+        <w:rPr>
+          <w:rFonts w:ascii="Times New Roman" w:hAnsi="Times New Roman"/>
+          <w:sz w:val="24"/>
           <w:i/>
-          <w:szCs w:val="24"/>
-          <w:lang w:val="en-US"/>
-        </w:rPr>
-        <w:t>OPC Unified Architecture Part 4: Services</w:t>
-      </w:r>
-      <w:r>
-        <w:rPr>
-          <w:rFonts w:eastAsia="Times New Roman"/>
-          <w:szCs w:val="24"/>
-          <w:lang w:val="en-US"/>
-        </w:rPr>
-        <w:t xml:space="preserve"> (Section 5.11.2). Retrieved October 29, 2026, from https://reference.opcfoundation.org/specs/OPC-10000-4/5.11.2</w:t>
+        </w:rPr>
+        <w:t xml:space="preserve">OPC Unified Architecture Part 4: Services</w:t>
+      </w:r>
+      <w:r>
+        <w:rPr>
+          <w:rFonts w:ascii="Times New Roman" w:hAnsi="Times New Roman"/>
+          <w:sz w:val="24"/>
+        </w:rPr>
+        <w:t xml:space="preserve"> (Version 1.05.07, Section 5.11.2). https://reference.opcfoundation.org/specs/OPC-10000-4/5.11.2</w:t>
       </w:r>
     </w:p>
     <w:p>
@@ -11417,14 +11885,14 @@
           <w:szCs w:val="24"/>
           <w:lang w:val="en-US"/>
         </w:rPr>
-        <w:t xml:space="preserve"> (Version article1-submission-20261030-r2) [Source code and synthetic data]. </w:t>
+        <w:t xml:space="preserve"> (Version article1-submission-20261030-r3) [Source code and synthetic data]. </w:t>
       </w:r>
       <w:r>
         <w:rPr>
           <w:rFonts w:eastAsia="Times New Roman"/>
           <w:szCs w:val="24"/>
         </w:rPr>
-        <w:t>GitHub. https://github.com/aizexss/unidirectional/tree/article1-submission-20261030-r2</w:t>
+        <w:t>GitHub. https://github.com/aizexss/unidirectional/tree/article1-submission-20261030-r3</w:t>
       </w:r>
     </w:p>
     <w:sectPr>

</xml_diff>

<commit_message>
docs: refine academic prose and update current authorship
</commit_message>
<xml_diff>
--- a/manuscript/Ibragimov_Aibar_Article_Revised.docx
+++ b/manuscript/Ibragimov_Aibar_Article_Revised.docx
@@ -106,57 +106,6 @@
     </w:p>
     <w:p>
       <w:pPr>
-        <w:pStyle w:val="Authors"/>
-        <w:jc w:val="left"/>
-      </w:pPr>
-      <w:r>
-        <w:rPr>
-          <w:b/>
-        </w:rPr>
-        <w:t>Laura Aldasheva</w:t>
-      </w:r>
-    </w:p>
-    <w:p>
-      <w:pPr>
-        <w:rPr>
-          <w:lang w:val="en-US"/>
-        </w:rPr>
-      </w:pPr>
-      <w:r>
-        <w:rPr>
-          <w:rFonts w:eastAsia="Times New Roman"/>
-          <w:szCs w:val="24"/>
-          <w:lang w:val="en-US"/>
-        </w:rPr>
-        <w:t>laura.aldasheva@astanait.edu.kz</w:t>
-      </w:r>
-    </w:p>
-    <w:p>
-      <w:pPr>
-        <w:rPr>
-          <w:lang w:val="en-US"/>
-        </w:rPr>
-      </w:pPr>
-      <w:r>
-        <w:rPr>
-          <w:rFonts w:eastAsia="Times New Roman"/>
-          <w:szCs w:val="24"/>
-          <w:lang w:val="en-US"/>
-        </w:rPr>
-        <w:t>School of Intelligent Systems, Astana IT University, Astana, Kazakhstan.</w:t>
-      </w:r>
-      <w:r>
-        <w:rPr>
-          <w:rFonts w:eastAsia="Times New Roman"/>
-          <w:szCs w:val="24"/>
-          <w:lang w:val="en-US"/>
-        </w:rPr>
-        <w:br/>
-        <w:t>ORCID: 0000-0001-6815-1989</w:t>
-      </w:r>
-    </w:p>
-    <w:p>
-      <w:pPr>
         <w:pStyle w:val="12"/>
         <w:keepNext/>
         <w:keepLines/>
@@ -187,7 +136,7 @@
           <w:szCs w:val="24"/>
           <w:lang w:val="en-US"/>
         </w:rPr>
-        <w:t>Abstract: Industrial applications often combine received sensor fields when deciding whether a process is healthy. A complete vector can nevertheless contain values from different source captures, and repeated values can hide this mixture. This study asks what a receiver on a one-way link can establish about common capture when only values, origin identifiers or grouping evidence are available. The contribution is a provenance contract with an explicit rule for conclusive and ambiguous verdicts, and a quantitative assessment of the mixing that values alone cannot reveal. The method uses compatible explanations, exact finite-state checks and a discrete-event experiment comparing separate-field and whole-object publication. Twelve synthetic conditions vary source correlation, message loss and receiver restart. Forty replicate indices per condition produce 960 mode runs and 3.84 million scheduled reads. Under independent message loss of 5% without restart, separate-field publication mixes generations in 62.14% of reads despite complete field availability. Whole-object publication has no mixed reads under the stated capture, binding and access assumptions. With identical delivery schedules and no loss, values reveal 5.88%, 49.84% and 79.13% of mixed reads as source flip probability rises from 0.05 to 0.50 and 0.95. Bursts and restart still limit the availability of a fresh coherent state. Independent event reconstruction checks the saved logs, while a clean rerun regenerates the numerical results from the supplied code. The findings show why provenance evidence and fresh coherent availability should accompany completeness and error rates. All data and timings are synthetic; physical-device performance is not measured and requires separate field validation.</w:t>
+        <w:t>Abstract: Industrial applications often combine received sensor fields when deciding whether a process is healthy. A complete vector can nevertheless contain values from different source captures, while repeated values may conceal this mixture. This study examines what a receiver on a one-way link can establish about common capture when only values, origin identifiers or grouping evidence are available. We specify a provenance contract with explicit rules for conclusive and ambiguous verdicts and provide a quantitative assessment of the extent of mixing that values alone cannot reveal. The method combines compatible explanations, exact finite-state checks and a discrete-event experiment comparing separate-field and whole-object publication. Twelve synthetic conditions vary source correlation, message loss and receiver restart. Forty replicate indices per condition yield 960 mode runs and 3.84 million scheduled reads. Under independent message loss of 5% without restart, separate-field publication mixes generations in 62.14% of reads despite complete field availability. Whole-object publication produces no mixed reads under the stated capture, origin binding and access assumptions. Under identical delivery schedules without loss, values reveal 5.88%, 49.84% and 79.13% of mixed reads at source flip probabilities of 0.05, 0.50 and 0.95, respectively. Burst loss and receiver restart limit the availability of a fresh coherent state. Independent event reconstruction verifies the saved logs, and a clean rerun regenerates the numerical results from the supplied code. The results support reporting provenance evidence and fresh coherent availability alongside completeness and error rates. All data and timings are synthetic; physical-device performance is not measured and requires separate field validation.</w:t>
       </w:r>
     </w:p>
     <w:p>
@@ -233,7 +182,7 @@
           <w:szCs w:val="24"/>
           <w:lang w:val="en-US"/>
         </w:rPr>
-        <w:t>A receiving application can combine individually plausible industrial values from different source captures. Delay, loss and asynchronous updates cause this mixture even when every received record is decoded correctly. Repeated values can conceal different origins, so completeness and numerical plausibility do not establish a common capture.</w:t>
+        <w:t>A receiving application may combine plausible industrial telemetry values from different source captures. Delay, loss and asynchronous updates can produce this mixture even when every record is decoded correctly. Repeated values may also conceal the different origins. Having all fields present therefore does not establish that they belong to one capture.</w:t>
       </w:r>
     </w:p>
     <w:p>
@@ -249,7 +198,7 @@
           <w:szCs w:val="24"/>
           <w:lang w:val="en-US"/>
         </w:rPr>
-        <w:t>In one-way telemetry, the receiver cannot request an immediate corrective exchange through the same channel. Operational-technology guidance and research on unidirectional syslog transfer describe this delivery context [1, 2]. Establishing common provenance additionally requires a capture contract, preserved origin identities and suitable receiver access.</w:t>
+        <w:t>A receiver on a one-way link cannot request an immediate correction through the same channel. Operational-technology guidance and work on unidirectional syslog transfer describe this setting [1, 2]. To establish common provenance, the system also needs a clear capture contract, preserved origin identities and suitable access at the receiver.</w:t>
       </w:r>
     </w:p>
     <w:p>
@@ -278,7 +227,7 @@
           <w:szCs w:val="24"/>
           <w:lang w:val="en-US"/>
         </w:rPr>
-        <w:t>The contribution is a domain-specific characterization of what a one-way receiver can establish about common source capture. It combines an explicit capture-to-read provenance contract with evidence conditions for proved coherence, proved mixing, ambiguity and contradiction.</w:t>
+        <w:t>This study examines when a receiver on a one-way link can establish that observed fields originate from a common source capture. We specify the capture-to-read contract and the evidence needed to distinguish proved coherence, proved mixing, ambiguity and contradiction.</w:t>
       </w:r>
     </w:p>
     <w:p>
@@ -294,7 +243,7 @@
           <w:szCs w:val="24"/>
           <w:lang w:val="en-US"/>
         </w:rPr>
-        <w:t>An equality-evidence certificate for the declared repeated diagonal family and a paired computational study quantify hidden mixing, conclusive coverage and fresh coherent availability. Atomic snapshots, compatible-explanation semantics and the four-valued verdict structure are established foundations; the contribution is their provenance-specific instantiation and reproducible evaluation under publication, loss and restart.</w:t>
+        <w:t>We combine an equality-evidence certificate for the declared repeated diagonal family with a paired computational study of field and object publication. Together, these quantify hidden mixing, conclusive coverage and fresh coherent availability. Atomic snapshots, compatible-explanation semantics and four-valued verdicts are established foundations. Our contribution is this explicit provenance-specific formulation and its reproducible evaluation under publication, loss and restart.</w:t>
       </w:r>
     </w:p>
     <w:p>
@@ -324,7 +273,7 @@
           <w:szCs w:val="24"/>
           <w:lang w:val="en-US"/>
         </w:rPr>
-        <w:t>Atomic snapshots and linearizability define indivisible access to concurrent objects [3]. Whether a returned vector represents one application capture depends on the object specification and update protocol. Distributed snapshots instead account for process and channel state, while logical clocks describe event order [4]. Here the property is common capture provenance at one receiving interface.</w:t>
+        <w:t>Atomic snapshots and linearizability concern indivisible access to specified concurrent objects [3]. Whether the returned vector also represents one application capture depends on the object specification and update protocol. Distributed snapshots address process and channel state, and logical clocks describe event order [4]. We focus on the capture origins of fields observed at one receiving interface.</w:t>
       </w:r>
     </w:p>
     <w:p>
@@ -340,7 +289,7 @@
           <w:szCs w:val="24"/>
           <w:lang w:val="en-US"/>
         </w:rPr>
-        <w:t>Temporal monitoring over unreliable, out-of-order streams is established [5,6]. Assumption-based approaches retain compatible executions; four-valued real-time and symbolic monitoring already address uncertainty [7,8]. Here these foundations are instantiated with capture-origin evidence. OPC UA serialization and PubSub provide grouping mechanisms [9,10], while access attributes and Read semantics define server-side boundaries [11,12]. The adapter must establish its capture and access contract.</w:t>
+        <w:t>Existing temporal monitors handle unreliable streams and events that arrive out of order [5,6]. Assumption-based methods retain executions compatible with the available observations. Four-valued real-time monitoring and symbolic stream monitoring already address uncertainty [7,8]; we apply these foundations to capture-origin evidence. OPC UA serialization and PubSub offer grouping mechanisms [9,10], while access attributes and Read semantics define server-side boundaries [11,12]. The adapter must still establish its own capture and access contract.</w:t>
       </w:r>
     </w:p>
     <w:p>
@@ -356,7 +305,7 @@
           <w:szCs w:val="24"/>
           <w:lang w:val="en-US"/>
         </w:rPr>
-        <w:t>Age-of-information research separates freshness from delivery [13], including industrial scheduling [14]. We measure fresh coherent availability. Separate random streams and documented generator behavior support comparisons [15,16]; bootstrap and simulation-reporting guidance motivate whole-run intervals and model disclosure [17,18]. Reproduction does not validate a physical installation [19]. Table 1 distinguishes established guarantees from this study’s scope.</w:t>
+        <w:t>Age-of-information research treats freshness separately from delivery [13], including in industrial scheduling [14]. Here we measure fresh coherent availability. Separate random streams and documented generator behavior support the comparison [15,16]. Bootstrap and simulation-reporting guidance motivate the use of whole-run intervals and explicit model descriptions [17,18]. Reproducing these computations does not validate a physical installation [19]. Table 1 sets out how this study relates to the established guarantees.</w:t>
       </w:r>
     </w:p>
     <w:p>
@@ -843,9 +792,10 @@
         <w:rPr>
           <w:lang w:val="en-US"/>
         </w:rPr>
-      </w:pPr>
-      <w:r>
-        <w:t>The aim is to establish when a receiver can justify common capture provenance and receive a fresh coherent state. The objectives are to formalize evidence-based verdicts (RQ 1), quantify detection limits from repeated values and source correlation (RQ 2), and compare coherence, completeness and freshness under loss and receiver restart (RQ 3).</w:t>
+        <w:keepLines/>
+      </w:pPr>
+      <w:r>
+        <w:t>We aim to establish when a receiver can justify common capture provenance and receive a fresh coherent state. The study has three objectives: to formalize evidence-based verdicts (RQ 1), to quantify detection limits due to repeated values and source correlation (RQ 2), and to compare coherence, completeness and freshness under loss and receiver restart (RQ 3).</w:t>
       </w:r>
     </w:p>
     <w:p>
@@ -1059,13 +1009,13 @@
           <w:szCs w:val="24"/>
           <w:lang w:val="en-US"/>
         </w:rPr>
-        <w:t xml:space="preserve">Separate publication R0 replaces one delivered value-origin pair at a time. Whole-object publication R1 atomically replaces the vector with a validated object. Both modes use atomic consumer reads. Each value must remain atomically bound to its origin; otherwise a read can observe a false pairing. </w:t>
-      </w:r>
-      <w:r>
-        <w:rPr>
-          <w:szCs w:val="24"/>
-        </w:rPr>
-        <w:t>Fig. 1 identifies these boundaries.</w:t>
+        <w:t xml:space="preserve">Under separate publication R0, the receiver replaces one delivered value-origin pair at a time. Under whole-object publication R1, it atomically replaces the vector with a validated object. Consumer reads are atomic in both modes. A value must also remain atomically bound to its origin; otherwise the receiver may read a false pairing. Fig. 1 shows these boundaries.</w:t>
+      </w:r>
+      <w:r>
+        <w:rPr>
+          <w:szCs w:val="24"/>
+        </w:rPr>
+        <w:t/>
       </w:r>
     </w:p>
     <w:p>
@@ -1147,7 +1097,7 @@
           <w:szCs w:val="24"/>
           <w:lang w:val="en-US"/>
         </w:rPr>
-        <w:t>Coherence, freshness, completeness and authenticity are separate properties. An old object can remain coherent. Origin equality neither authenticates the sender nor establishes physical isolation. Identity comparison needs no synchronized clocks; physical age needs a justified time relation. Capture atomicity, preserved origin binding, publication and read atomicity must each hold along the adapter path.</w:t>
+        <w:t>Coherence, freshness, completeness and authenticity describe different properties. An old object may still be coherent. Equal origins do not authenticate the sender or establish physical isolation. Comparing identities requires no synchronized clocks, whereas measuring physical age requires a justified time relation. Capture atomicity, origin binding, publication and read atomicity must all be preserved along the adapter path.</w:t>
       </w:r>
     </w:p>
     <w:p>
@@ -1175,7 +1125,7 @@
           <w:szCs w:val="24"/>
           <w:lang w:val="en-US"/>
         </w:rPr>
-        <w:t>Consider an illustrative pump-monitoring application that exports motor-running status r and discharge pressure p to an IT-side diagnostic service through a one-way gateway. Each source capture produces an immutable object with epoch, generation, capture time, r, p and quality. Origin (epoch, generation) remains bound to every field; capture time supports a separate freshness check. For this example, the diagnostic raises a low-pressure alarm when r=1 and p&lt;2 bar. The threshold and values below are scenario assumptions.</w:t>
+        <w:t>Consider a diagnostic service on the IT side of a one-way gateway. The service receives motor-running status r and discharge pressure p from a pump. Each source capture produces an immutable object containing epoch, generation, capture time, r, p and quality. The origin (epoch, generation) stays bound to every field, while capture time supports a separate freshness check. In this illustrative scenario, the service raises a low-pressure alarm when r=1 and p&lt;2 bar. The threshold and values are scenario assumptions.</w:t>
       </w:r>
     </w:p>
     <w:p>
@@ -1207,7 +1157,7 @@
           <w:szCs w:val="24"/>
           <w:lang w:val="en-US"/>
         </w:rPr>
-        <w:t xml:space="preserve">Profile I detects unequal origins in these pairs; values alone cannot prove mixing because the catalogue permits (1,0.4) and (1,3.2) as valid captures. R1 installs each captured object as a unit, avoiding this cross-generation decision error while still requiring freshness checks. It cannot guarantee immediate fault detection when a new capture is delayed or lost. Adding one identifier after separate source reads would not satisfy the capture contract. This scenario explains the </w:t>
+        <w:t xml:space="preserve">Profile I detects the unequal origins in these pairs. Values alone cannot prove mixing, because the catalogue allows (1,0.4) and (1,3.2) as valid captures. R1 avoids this cross-generation decision error by installing each captured object as a unit, but it still needs freshness checks. A delayed or lost capture can prevent immediate fault detection. Attaching one identifier after separate source reads would not meet the capture contract. The example illustrates the practical consequence of mixing; the binary study below tests the verification mechanism, not the pump’s physical dynamics.</w:t>
       </w:r>
       <w:r>
         <w:rPr>
@@ -1215,7 +1165,7 @@
           <w:lang w:val="en-US"/>
         </w:rPr>
         <w:lastRenderedPageBreak/>
-        <w:t>application consequence; the following binary study tests the verification mechanism rather than the pump’s physical dynamics.</w:t>
+        <w:t/>
       </w:r>
     </w:p>
     <w:p>
@@ -2072,7 +2022,7 @@
           <w:szCs w:val="24"/>
           <w:lang w:val="en-US"/>
         </w:rPr>
-        <w:t>Two distinct generations can both contain (0,0). Taking both fields from either generation and taking one from each gives identical values, forcing a sound pointwise values-only classifier to remain ambiguous. Under the diagonal catalogue, (0,1) proves mixing because no admissible capture contains it. Additional justified history can refine the problem; extra computation alone cannot separate identical permitted observations.</w:t>
+        <w:t>Suppose two distinct generations both contain (0,0). Both a coherent read from one generation and a mixed read across the two generations produce the same observed pair. A sound pointwise classifier that sees only values must therefore remain ambiguous. Under the diagonal catalogue, (0,1) proves mixing because no admissible capture contains that pair. Justified history can add information, but extra computation alone cannot distinguish identical permitted observations.</w:t>
       </w:r>
     </w:p>
     <w:p>
@@ -3242,33 +3192,33 @@
           <w:szCs w:val="24"/>
           <w:lang w:val="en-US"/>
         </w:rPr>
-        <w:t xml:space="preserve">The experiment crosses </w:t>
-      </w:r>
-      <w:r>
-        <w:rPr>
-          <w:szCs w:val="24"/>
-        </w:rPr>
-        <w:t>α</w:t>
-      </w:r>
-      <w:r>
-        <w:rPr>
-          <w:szCs w:val="24"/>
-          <w:lang w:val="en-US"/>
-        </w:rPr>
-        <w:t xml:space="preserve">=0.05, 0.50 and 0.95 with three channels: no loss, independent loss and shared burst loss. Three additional conditions test receiver restart at </w:t>
-      </w:r>
-      <w:r>
-        <w:rPr>
-          <w:szCs w:val="24"/>
-        </w:rPr>
-        <w:t>α</w:t>
-      </w:r>
-      <w:r>
-        <w:rPr>
-          <w:szCs w:val="24"/>
-          <w:lang w:val="en-US"/>
-        </w:rPr>
-        <w:t>=0.50 (Table 4). Forty independent replicate indices per condition yield 480 condition-specific pairs and 960 mode runs. Common random inputs couple conditions, so the 480 pairs are not mutually independent. Table 4 and the artifact configuration record the declared factors and analysis settings.</w:t>
+        <w:t xml:space="preserve">We combine α=0.05, 0.50 and 0.95 with three channel conditions: no loss, independent loss and shared burst loss. Three further conditions introduce receiver restart at α=0.50 (Table 4). Each condition uses forty independent replicate indices, giving 480 condition-specific pairs and 960 mode runs. Common random inputs couple the conditions, so the 480 pairs are not mutually independent. Table 4 and the artifact configuration specify the factors and analysis settings.</w:t>
+      </w:r>
+      <w:r>
+        <w:rPr>
+          <w:szCs w:val="24"/>
+        </w:rPr>
+        <w:t/>
+      </w:r>
+      <w:r>
+        <w:rPr>
+          <w:szCs w:val="24"/>
+          <w:lang w:val="en-US"/>
+        </w:rPr>
+        <w:t xml:space="preserve"/>
+      </w:r>
+      <w:r>
+        <w:rPr>
+          <w:szCs w:val="24"/>
+        </w:rPr>
+        <w:t/>
+      </w:r>
+      <w:r>
+        <w:rPr>
+          <w:szCs w:val="24"/>
+          <w:lang w:val="en-US"/>
+        </w:rPr>
+        <w:t/>
       </w:r>
     </w:p>
     <w:p>
@@ -4852,7 +4802,7 @@
           <w:szCs w:val="24"/>
           <w:lang w:val="en-US"/>
         </w:rPr>
-        <w:t>Source transitions, outages, delay, independent loss and read phase use separate SHA-256-keyed pseudo-random streams. Draws remain assigned to messages even when discarded. Ties process reset or ready first, arrivals second and reads last. Monotonic admission is outside the contract, so an older arrival can replace newer state.</w:t>
+        <w:t>Source transitions, outages, delay, independent loss and read phase have separate SHA-256-keyed pseudo-random streams. Random draws stay assigned to their messages even when those messages are discarded. At tied times, reset or ready events are processed first, arrivals second and reads last. The contract does not require monotonic admission: an older arrival may therefore replace newer state.</w:t>
       </w:r>
     </w:p>
     <w:p>
@@ -4884,7 +4834,7 @@
           <w:szCs w:val="24"/>
           <w:lang w:val="en-US"/>
         </w:rPr>
-        <w:t>The primary endpoint is actual mixed origins as a share of all planned reads and its paired R0−R1 contrast. Completeness, hidden mixing and conclusive coverage share the 4,000-read denominator. Fresh coherent availability additionally requires age ≤100 synthetic ms, an analysis threshold rather than an industrial limit. Age exists only for complete coherent states; mixed and unavailable states have undefined age.</w:t>
+        <w:t>Our primary endpoint is the share of all planned reads with mixed origins, together with its paired R0−R1 contrast. Completeness, hidden mixing and conclusive coverage use the same 4,000-read denominator. Fresh coherent availability also requires age ≤100 synthetic ms. This is an analysis threshold, not an industrial limit. Age is defined only for complete coherent states; mixed and unavailable states have no defined age.</w:t>
       </w:r>
     </w:p>
     <w:p>
@@ -6253,20 +6203,20 @@
           <w:szCs w:val="24"/>
           <w:lang w:val="en-US"/>
         </w:rPr>
-        <w:t xml:space="preserve">With all four binary pairs admitted in </w:t>
-      </w:r>
-      <w:r>
-        <w:rPr>
-          <w:szCs w:val="24"/>
-        </w:rPr>
-        <w:t>Γ</w:t>
-      </w:r>
-      <w:r>
-        <w:rPr>
-          <w:szCs w:val="24"/>
-          <w:lang w:val="en-US"/>
-        </w:rPr>
-        <w:t>, every complete V observation becomes ambiguous on the same actual states. The origins remain mixed, but unequal values no longer contradict one capture. Conversely, omitting a truly admissible vector can create a false contradiction. Catalogue constraints therefore need independent justification.</w:t>
+        <w:t xml:space="preserve">If Γ admits all four binary pairs, every complete V observation becomes ambiguous on the same actual states. The actual origins remain unchanged, but unequal values no longer rule out a single capture. Excluding a genuinely admissible vector has the opposite risk: it can create a false contradiction. The catalogue constraints therefore need independent justification.</w:t>
+      </w:r>
+      <w:r>
+        <w:rPr>
+          <w:szCs w:val="24"/>
+        </w:rPr>
+        <w:t/>
+      </w:r>
+      <w:r>
+        <w:rPr>
+          <w:szCs w:val="24"/>
+          <w:lang w:val="en-US"/>
+        </w:rPr>
+        <w:t/>
       </w:r>
     </w:p>
     <w:p>
@@ -8949,7 +8899,7 @@
           <w:szCs w:val="24"/>
           <w:lang w:val="en-US"/>
         </w:rPr>
-        <w:t>All nine conditions without restart achieve 100% completeness after warmup, although retained fields may be mixed or stale. In C05, fresh coherent availability is 37.86% for R0 and 99.99% for R1. A zero-delay control eliminates R0 mixing when all simultaneous arrivals precede the read, confirming the role of asynchronous delivery.</w:t>
+        <w:t>After warmup, all nine conditions without restart have 100% completeness, although the retained fields may be mixed or stale. In C05, fresh coherent availability is 37.86% for R0 and 99.99% for R1. In the zero-delay control, R0 mixing disappears when all simultaneous arrivals are processed before the read. This confirms the role of asynchronous delivery in the model.</w:t>
       </w:r>
     </w:p>
     <w:p>
@@ -9838,26 +9788,26 @@
           <w:szCs w:val="24"/>
           <w:lang w:val="en-US"/>
         </w:rPr>
-        <w:t xml:space="preserve">Without loss, V detects 5.878%, 49.839% and 79.129% of mixed reads at </w:t>
-      </w:r>
-      <w:r>
-        <w:rPr>
-          <w:szCs w:val="24"/>
-        </w:rPr>
-        <w:t>α</w:t>
-      </w:r>
-      <w:r>
-        <w:rPr>
-          <w:szCs w:val="24"/>
-          <w:lang w:val="en-US"/>
-        </w:rPr>
-        <w:t xml:space="preserve">=0.05, 0.50 and 0.95; lag-weighted predictions are 5.935%, 50.000% and 79.180%. Residual intervals include zero. Fig. 4 shows pooled lag-specific detection ratios and whole-run bootstrap intervals for C01, C04 and C07; these ratios differ from means of run-level ratios. </w:t>
-      </w:r>
-      <w:r>
-        <w:rPr>
-          <w:szCs w:val="24"/>
-        </w:rPr>
-        <w:t>Sparse lags supply no extra independent replications.</w:t>
+        <w:t xml:space="preserve">Without loss, V detects 5.878%, 49.839% and 79.129% of mixed reads at α=0.05, 0.50 and 0.95. The lag-weighted predictions are 5.935%, 50.000% and 79.180%, and the residual intervals include zero. Fig. 4 shows pooled lag-specific detection ratios and whole-run bootstrap intervals for C01, C04 and C07. These pooled ratios differ from means of run-level ratios; sparse lags do not add independent replications.</w:t>
+      </w:r>
+      <w:r>
+        <w:rPr>
+          <w:szCs w:val="24"/>
+        </w:rPr>
+        <w:t/>
+      </w:r>
+      <w:r>
+        <w:rPr>
+          <w:szCs w:val="24"/>
+          <w:lang w:val="en-US"/>
+        </w:rPr>
+        <w:t xml:space="preserve"/>
+      </w:r>
+      <w:r>
+        <w:rPr>
+          <w:szCs w:val="24"/>
+        </w:rPr>
+        <w:t/>
       </w:r>
     </w:p>
     <w:p>
@@ -10130,7 +10080,7 @@
           <w:lang w:val="en-US"/>
         </w:rPr>
         <w:lastRenderedPageBreak/>
-        <w:t>Negative controls give unavailable for missing state and out_of_model for contradictory evidence. False grouping of an equal-valued mixed pair can instead give coherent: the false premise excludes the actual explanation without creating a contradiction. Zero conclusive I/G errors under truthful binding therefore do not measure authentication strength.</w:t>
+        <w:t>The negative controls return unavailable for missing state and out_of_model for contradictory evidence. A falsely grouped equal-valued mixed pair can instead be classified as coherent: the false premise removes the actual explanation without producing a contradiction. The absence of conclusive I/G errors under truthful binding does not measure authentication strength.</w:t>
       </w:r>
     </w:p>
     <w:p>
@@ -10160,7 +10110,7 @@
           <w:szCs w:val="24"/>
           <w:lang w:val="en-US"/>
         </w:rPr>
-        <w:t>A deployment should define generations at capture, preserve origin binding and publish and read whole objects when common capture is required. The pump example illustrates the consequence: a complete, plausible pair can trigger a false alarm or suppress a valid one. Fresh coherent availability and evidential coverage should therefore accompany reported error rates.</w:t>
+        <w:t>A deployment that requires common capture should assign generation identifiers at capture, preserve origin binding, and publish and read whole objects. The pump example shows why these steps matter: a complete and plausible pair can raise a false alarm or suppress a warranted alarm. Reported error rates should therefore be accompanied by fresh coherent availability and evidential coverage.</w:t>
       </w:r>
     </w:p>
     <w:p>
@@ -10176,7 +10126,7 @@
           <w:szCs w:val="24"/>
           <w:lang w:val="en-US"/>
         </w:rPr>
-        <w:t>The model uses two binary fields, bounded delay, one burst process and at most one restart. It omits fragmentation, congestion, finite buffers, CPU contention, physical sampling and clock error. Representation and message count differ between R0 and R1, preventing a vendor-specific or byte-normalized interpretation. The pump scenario is illustrative; the diagonal catalogue is a diagnostic source family, not a plant model.</w:t>
+        <w:t>The dynamic simulation uses two binary fields, bounded delay, one burst process and at most one restart. It does not represent fragmentation, congestion, finite buffers, CPU contention, physical sampling or clock error. R0 and R1 differ in representation and message count, so the comparison cannot be interpreted as a vendor-specific or byte-normalized result. The pump example is illustrative, and the diagonal catalogue is a diagnostic source family rather than a plant model.</w:t>
       </w:r>
     </w:p>
     <w:p>
@@ -10192,7 +10142,7 @@
           <w:szCs w:val="24"/>
           <w:lang w:val="en-US"/>
         </w:rPr>
-        <w:t>Forty replicate indices and one pseudo-random generator family limit coverage of possible realizations. Intervals describe variation within the synthetic model, excluding physical-parameter uncertainty and simultaneous coverage across results. Equipment studies must validate capture, origin binding, publication, reads, clocks and channel parameters, while distinguishing logger failure from receiver downtime.</w:t>
+        <w:t>The use of forty replicate indices and a single pseudo-random generator family limits the range of realizations examined. The intervals describe variation within the synthetic model; they do not account for physical-parameter uncertainty or provide simultaneous coverage across results. Equipment studies would need to validate capture, origin binding, publication, reads, clocks and channel parameters. Such studies would also need to distinguish logger failure from receiver downtime.</w:t>
       </w:r>
     </w:p>
     <w:p>
@@ -10223,7 +10173,7 @@
           <w:szCs w:val="24"/>
           <w:lang w:val="en-US"/>
         </w:rPr>
-        <w:t>Common provenance is verifiable only when the available evidence excludes mixed origins. Repeated values can make this impossible for a values-only monitor, and source correlation changes how much mixing remains visible. Whole-object publication preserves coherence under the stated contract, while freshness and availability require separate evaluation. The contribution is a precise provenance-verification criterion and its measurable observation limits, supported by reproducible synthetic results.</w:t>
+        <w:t>A receiver can establish common provenance only if the available evidence rules out mixed origins. Repeated values can prevent a values-only monitor from doing so, and source correlation changes the fraction of mixing it can detect. Whole-object publication preserves coherence under the stated contract, but freshness and availability still require separate evaluation. This study makes those evidence conditions explicit and quantifies their observation limits with reproducible synthetic results.</w:t>
       </w:r>
     </w:p>
     <w:p>
@@ -10269,7 +10219,7 @@
           <w:szCs w:val="24"/>
           <w:lang w:val="en-US"/>
         </w:rPr>
-        <w:t>, under tag article1-submission-20261030-r3 [20]. The materials include source histories, the complete reading log, metrics, models, independent validators and SHA-256 manifests (Table 9).</w:t>
+        <w:t>, under tag article1-submission-20261030-r4 [20]. The materials include source histories, the complete reading log, metrics, models, independent validators and SHA-256 manifests (Table 9).</w:t>
       </w:r>
     </w:p>
     <w:p>
@@ -10285,7 +10235,7 @@
           <w:szCs w:val="24"/>
           <w:lang w:val="en-US"/>
         </w:rPr>
-        <w:t>Run python reproduce.py --verify-only to check supplied evidence, or python reproduce.py --full to regenerate numerical outputs in a temporary copy after removing previous results. Numbered stages write reports/RESULTS.md and reports/verification_summary.json. Independent checks reconstruct every read tuple and compare numerical tables and figure files with this manuscript.</w:t>
+        <w:t>Use python reproduce.py --verify-only to check the supplied evidence. To regenerate numerical outputs, run python reproduce.py --full; this first removes previous results from a temporary copy. The numbered stages write reports/RESULTS.md and reports/verification_summary.json. Independent checks reconstruct every read tuple and compare the numerical tables and figure files with this manuscript.</w:t>
       </w:r>
     </w:p>
     <w:p>
@@ -10301,7 +10251,7 @@
           <w:szCs w:val="24"/>
           <w:lang w:val="en-US"/>
         </w:rPr>
-        <w:t>Full reproduction compares newly created CSV/JSON files and decompressed readings with the reference. Separately, plot_figures.py redraws all six figures from the same analytical expressions and CSV data; audit_plots.py checks the recorded plotting values. Plotting requires the optional packages listed in requirements-figures.txt. The repository gives commands and font requirements. The pump example is illustrative; physical-equipment measurements are outside this computational reproduction.</w:t>
+        <w:t>Full reproduction compares regenerated CSV/JSON files and decompressed readings with the reference. The separate script plot_figures.py redraws all six figures from the analytical expressions and CSV data, and audit_plots.py checks the recorded plotting values. The optional plotting packages are listed in requirements-figures.txt; commands and font requirements are in the repository. The pump example is illustrative. Physical-equipment measurements are outside the scope of this computational reproduction.</w:t>
       </w:r>
     </w:p>
     <w:p>
@@ -11885,14 +11835,14 @@
           <w:szCs w:val="24"/>
           <w:lang w:val="en-US"/>
         </w:rPr>
-        <w:t xml:space="preserve"> (Version article1-submission-20261030-r3) [Source code and synthetic data]. </w:t>
+        <w:t xml:space="preserve"> (Version article1-submission-20261030-r4) [Source code and synthetic data]. </w:t>
       </w:r>
       <w:r>
         <w:rPr>
           <w:rFonts w:eastAsia="Times New Roman"/>
           <w:szCs w:val="24"/>
         </w:rPr>
-        <w:t>GitHub. https://github.com/aizexss/unidirectional/tree/article1-submission-20261030-r3</w:t>
+        <w:t>GitHub. https://github.com/aizexss/unidirectional/tree/article1-submission-20261030-r4</w:t>
       </w:r>
     </w:p>
     <w:sectPr>

</xml_diff>